<commit_message>
Formata os 4 documentos segundo a ABNT (NBR 14724)
A4, margens 3/3/2/2 cm, fonte 12, espacamento 1,5, recuo de 1,25 cm, titulos numerados sem ponto (secao primaria em maiusculas, nova pagina), figuras com legenda 'Figura X' e 'Fonte:', numeracao no canto superior direito, sumario centralizado. Mantido leve uso do laranja nos titulos (opcao b). Co-Authored-By: Claude Opus 4.8 <noreply@anthropic.com>
</commit_message>
<xml_diff>
--- a/docs/Remio - Arquitetura, Seguranca e Qualidade.docx
+++ b/docs/Remio - Arquitetura, Seguranca e Qualidade.docx
@@ -9,7 +9,7 @@
     </w:p>
     <w:p>
       <w:pPr>
-        <w:spacing w:after="80" w:before="0" w:line="276"/>
+        <w:spacing w:after="80" w:before="0" w:line="360"/>
         <w:jc w:val="center"/>
       </w:pPr>
       <w:r>
@@ -25,7 +25,7 @@
     </w:p>
     <w:p>
       <w:pPr>
-        <w:spacing w:after="560" w:before="0" w:line="276"/>
+        <w:spacing w:after="560" w:before="0" w:line="360"/>
         <w:jc w:val="center"/>
       </w:pPr>
       <w:r>
@@ -39,7 +39,7 @@
     </w:p>
     <w:p>
       <w:pPr>
-        <w:spacing w:after="10" w:before="0" w:line="276"/>
+        <w:spacing w:after="10" w:before="0" w:line="360"/>
         <w:jc w:val="center"/>
       </w:pPr>
       <w:r>
@@ -55,7 +55,7 @@
     </w:p>
     <w:p>
       <w:pPr>
-        <w:spacing w:after="60" w:before="0" w:line="276"/>
+        <w:spacing w:after="60" w:before="0" w:line="360"/>
         <w:jc w:val="center"/>
       </w:pPr>
       <w:r>
@@ -71,7 +71,7 @@
     </w:p>
     <w:p>
       <w:pPr>
-        <w:spacing w:after="1100" w:before="0" w:line="276"/>
+        <w:spacing w:after="1100" w:before="0" w:line="360"/>
         <w:jc w:val="center"/>
       </w:pPr>
       <w:r>
@@ -85,7 +85,7 @@
     </w:p>
     <w:p>
       <w:pPr>
-        <w:spacing w:after="80" w:before="0" w:line="276"/>
+        <w:spacing w:after="80" w:before="0" w:line="360"/>
         <w:jc w:val="center"/>
       </w:pPr>
       <w:r>
@@ -99,7 +99,7 @@
     </w:p>
     <w:p>
       <w:pPr>
-        <w:spacing w:after="80" w:before="0" w:line="276"/>
+        <w:spacing w:after="80" w:before="0" w:line="360"/>
         <w:jc w:val="center"/>
       </w:pPr>
       <w:r>
@@ -113,7 +113,7 @@
     </w:p>
     <w:p>
       <w:pPr>
-        <w:spacing w:after="700" w:before="0" w:line="276"/>
+        <w:spacing w:after="700" w:before="0" w:line="360"/>
         <w:jc w:val="center"/>
       </w:pPr>
       <w:r>
@@ -127,7 +127,7 @@
     </w:p>
     <w:p>
       <w:pPr>
-        <w:spacing w:after="120" w:before="0" w:line="276"/>
+        <w:spacing w:after="120" w:before="0" w:line="360"/>
         <w:jc w:val="center"/>
       </w:pPr>
       <w:r>
@@ -146,39 +146,40 @@
     </w:p>
     <w:p>
       <w:pPr>
-        <w:spacing w:after="240" w:before="0" w:line="276"/>
+        <w:spacing w:after="360" w:before="0" w:line="360"/>
+        <w:jc w:val="center"/>
       </w:pPr>
       <w:r>
         <w:rPr>
           <w:b/>
           <w:bCs/>
           <w:color w:val="1F2937"/>
-          <w:sz w:val="32"/>
-          <w:szCs w:val="32"/>
-        </w:rPr>
-        <w:t xml:space="preserve">Sumário</w:t>
+          <w:sz w:val="24"/>
+          <w:szCs w:val="24"/>
+        </w:rPr>
+        <w:t xml:space="preserve">SUMÁRIO</w:t>
       </w:r>
     </w:p>
     <w:p>
       <w:pPr>
         <w:tabs>
-          <w:tab w:val="right" w:pos="9180" w:leader="dot"/>
+          <w:tab w:val="right" w:pos="9071" w:leader="dot"/>
         </w:tabs>
-        <w:spacing w:after="120" w:line="276"/>
+        <w:spacing w:after="120" w:line="360"/>
       </w:pPr>
       <w:r>
         <w:rPr>
           <w:color w:val="1F2937"/>
-          <w:sz w:val="22"/>
-          <w:szCs w:val="22"/>
-        </w:rPr>
-        <w:t xml:space="preserve">1. Introdução e Arquitetura-Alvo</w:t>
+          <w:sz w:val="24"/>
+          <w:szCs w:val="24"/>
+        </w:rPr>
+        <w:t xml:space="preserve">1 Introdução e Arquitetura-Alvo</w:t>
       </w:r>
       <w:r>
         <w:rPr>
           <w:color w:val="1F2937"/>
-          <w:sz w:val="22"/>
-          <w:szCs w:val="22"/>
+          <w:sz w:val="24"/>
+          <w:szCs w:val="24"/>
         </w:rPr>
         <w:t xml:space="preserve">	3</w:t>
       </w:r>
@@ -186,47 +187,47 @@
     <w:p>
       <w:pPr>
         <w:tabs>
-          <w:tab w:val="right" w:pos="9180" w:leader="dot"/>
+          <w:tab w:val="right" w:pos="9071" w:leader="dot"/>
         </w:tabs>
-        <w:spacing w:after="120" w:line="276"/>
+        <w:spacing w:after="120" w:line="360"/>
       </w:pPr>
       <w:r>
         <w:rPr>
           <w:color w:val="1F2937"/>
-          <w:sz w:val="22"/>
-          <w:szCs w:val="22"/>
-        </w:rPr>
-        <w:t xml:space="preserve">2. Estilo Arquitetural: Monólito Modular e Microsserviços</w:t>
+          <w:sz w:val="24"/>
+          <w:szCs w:val="24"/>
+        </w:rPr>
+        <w:t xml:space="preserve">2 Estilo Arquitetural: Monólito Modular e Microsserviços</w:t>
       </w:r>
       <w:r>
         <w:rPr>
           <w:color w:val="1F2937"/>
-          <w:sz w:val="22"/>
-          <w:szCs w:val="22"/>
-        </w:rPr>
-        <w:t xml:space="preserve">	4</w:t>
+          <w:sz w:val="24"/>
+          <w:szCs w:val="24"/>
+        </w:rPr>
+        <w:t xml:space="preserve">	5</w:t>
       </w:r>
     </w:p>
     <w:p>
       <w:pPr>
         <w:tabs>
-          <w:tab w:val="right" w:pos="9180" w:leader="dot"/>
+          <w:tab w:val="right" w:pos="9071" w:leader="dot"/>
         </w:tabs>
-        <w:spacing w:after="120" w:line="276"/>
+        <w:spacing w:after="120" w:line="360"/>
       </w:pPr>
       <w:r>
         <w:rPr>
           <w:color w:val="1F2937"/>
-          <w:sz w:val="22"/>
-          <w:szCs w:val="22"/>
-        </w:rPr>
-        <w:t xml:space="preserve">3. Segurança em Camadas</w:t>
+          <w:sz w:val="24"/>
+          <w:szCs w:val="24"/>
+        </w:rPr>
+        <w:t xml:space="preserve">3 Segurança em Camadas</w:t>
       </w:r>
       <w:r>
         <w:rPr>
           <w:color w:val="1F2937"/>
-          <w:sz w:val="22"/>
-          <w:szCs w:val="22"/>
+          <w:sz w:val="24"/>
+          <w:szCs w:val="24"/>
         </w:rPr>
         <w:t xml:space="preserve">	6</w:t>
       </w:r>
@@ -234,23 +235,23 @@
     <w:p>
       <w:pPr>
         <w:tabs>
-          <w:tab w:val="right" w:pos="9180" w:leader="dot"/>
+          <w:tab w:val="right" w:pos="9071" w:leader="dot"/>
         </w:tabs>
-        <w:spacing w:after="120" w:line="276"/>
+        <w:spacing w:after="120" w:line="360"/>
       </w:pPr>
       <w:r>
         <w:rPr>
           <w:color w:val="1F2937"/>
-          <w:sz w:val="22"/>
-          <w:szCs w:val="22"/>
-        </w:rPr>
-        <w:t xml:space="preserve">     3.1. Proteção contra SQL Injection</w:t>
+          <w:sz w:val="24"/>
+          <w:szCs w:val="24"/>
+        </w:rPr>
+        <w:t xml:space="preserve">     3.1 Proteção contra SQL Injection</w:t>
       </w:r>
       <w:r>
         <w:rPr>
           <w:color w:val="1F2937"/>
-          <w:sz w:val="22"/>
-          <w:szCs w:val="22"/>
+          <w:sz w:val="24"/>
+          <w:szCs w:val="24"/>
         </w:rPr>
         <w:t xml:space="preserve">	7</w:t>
       </w:r>
@@ -258,23 +259,23 @@
     <w:p>
       <w:pPr>
         <w:tabs>
-          <w:tab w:val="right" w:pos="9180" w:leader="dot"/>
+          <w:tab w:val="right" w:pos="9071" w:leader="dot"/>
         </w:tabs>
-        <w:spacing w:after="120" w:line="276"/>
+        <w:spacing w:after="120" w:line="360"/>
       </w:pPr>
       <w:r>
         <w:rPr>
           <w:color w:val="1F2937"/>
-          <w:sz w:val="22"/>
-          <w:szCs w:val="22"/>
-        </w:rPr>
-        <w:t xml:space="preserve">4. Observabilidade</w:t>
+          <w:sz w:val="24"/>
+          <w:szCs w:val="24"/>
+        </w:rPr>
+        <w:t xml:space="preserve">4 Observabilidade</w:t>
       </w:r>
       <w:r>
         <w:rPr>
           <w:color w:val="1F2937"/>
-          <w:sz w:val="22"/>
-          <w:szCs w:val="22"/>
+          <w:sz w:val="24"/>
+          <w:szCs w:val="24"/>
         </w:rPr>
         <w:t xml:space="preserve">	8</w:t>
       </w:r>
@@ -282,23 +283,23 @@
     <w:p>
       <w:pPr>
         <w:tabs>
-          <w:tab w:val="right" w:pos="9180" w:leader="dot"/>
+          <w:tab w:val="right" w:pos="9071" w:leader="dot"/>
         </w:tabs>
-        <w:spacing w:after="120" w:line="276"/>
+        <w:spacing w:after="120" w:line="360"/>
       </w:pPr>
       <w:r>
         <w:rPr>
           <w:color w:val="1F2937"/>
-          <w:sz w:val="22"/>
-          <w:szCs w:val="22"/>
-        </w:rPr>
-        <w:t xml:space="preserve">5. Resiliência do Software</w:t>
+          <w:sz w:val="24"/>
+          <w:szCs w:val="24"/>
+        </w:rPr>
+        <w:t xml:space="preserve">5 Resiliência do Software</w:t>
       </w:r>
       <w:r>
         <w:rPr>
           <w:color w:val="1F2937"/>
-          <w:sz w:val="22"/>
-          <w:szCs w:val="22"/>
+          <w:sz w:val="24"/>
+          <w:szCs w:val="24"/>
         </w:rPr>
         <w:t xml:space="preserve">	9</w:t>
       </w:r>
@@ -306,23 +307,23 @@
     <w:p>
       <w:pPr>
         <w:tabs>
-          <w:tab w:val="right" w:pos="9180" w:leader="dot"/>
+          <w:tab w:val="right" w:pos="9071" w:leader="dot"/>
         </w:tabs>
-        <w:spacing w:after="120" w:line="276"/>
+        <w:spacing w:after="120" w:line="360"/>
       </w:pPr>
       <w:r>
         <w:rPr>
           <w:color w:val="1F2937"/>
-          <w:sz w:val="22"/>
-          <w:szCs w:val="22"/>
-        </w:rPr>
-        <w:t xml:space="preserve">6. Gestão de Backups e Recuperação de Desastres</w:t>
+          <w:sz w:val="24"/>
+          <w:szCs w:val="24"/>
+        </w:rPr>
+        <w:t xml:space="preserve">6 Gestão de Backups e Recuperação de Desastres</w:t>
       </w:r>
       <w:r>
         <w:rPr>
           <w:color w:val="1F2937"/>
-          <w:sz w:val="22"/>
-          <w:szCs w:val="22"/>
+          <w:sz w:val="24"/>
+          <w:szCs w:val="24"/>
         </w:rPr>
         <w:t xml:space="preserve">	10</w:t>
       </w:r>
@@ -330,23 +331,23 @@
     <w:p>
       <w:pPr>
         <w:tabs>
-          <w:tab w:val="right" w:pos="9180" w:leader="dot"/>
+          <w:tab w:val="right" w:pos="9071" w:leader="dot"/>
         </w:tabs>
-        <w:spacing w:after="120" w:line="276"/>
+        <w:spacing w:after="120" w:line="360"/>
       </w:pPr>
       <w:r>
         <w:rPr>
           <w:color w:val="1F2937"/>
-          <w:sz w:val="22"/>
-          <w:szCs w:val="22"/>
-        </w:rPr>
-        <w:t xml:space="preserve">7. Qualidade e Verificação Contínua</w:t>
+          <w:sz w:val="24"/>
+          <w:szCs w:val="24"/>
+        </w:rPr>
+        <w:t xml:space="preserve">7 Qualidade e Verificação Contínua</w:t>
       </w:r>
       <w:r>
         <w:rPr>
           <w:color w:val="1F2937"/>
-          <w:sz w:val="22"/>
-          <w:szCs w:val="22"/>
+          <w:sz w:val="24"/>
+          <w:szCs w:val="24"/>
         </w:rPr>
         <w:t xml:space="preserve">	11</w:t>
       </w:r>
@@ -354,23 +355,23 @@
     <w:p>
       <w:pPr>
         <w:tabs>
-          <w:tab w:val="right" w:pos="9180" w:leader="dot"/>
+          <w:tab w:val="right" w:pos="9071" w:leader="dot"/>
         </w:tabs>
-        <w:spacing w:after="120" w:line="276"/>
+        <w:spacing w:after="120" w:line="360"/>
       </w:pPr>
       <w:r>
         <w:rPr>
           <w:color w:val="1F2937"/>
-          <w:sz w:val="22"/>
-          <w:szCs w:val="22"/>
-        </w:rPr>
-        <w:t xml:space="preserve">8. Spec-Driven Development e CI/CD</w:t>
+          <w:sz w:val="24"/>
+          <w:szCs w:val="24"/>
+        </w:rPr>
+        <w:t xml:space="preserve">8 Spec-Driven Development e CI/CD</w:t>
       </w:r>
       <w:r>
         <w:rPr>
           <w:color w:val="1F2937"/>
-          <w:sz w:val="22"/>
-          <w:szCs w:val="22"/>
+          <w:sz w:val="24"/>
+          <w:szCs w:val="24"/>
         </w:rPr>
         <w:t xml:space="preserve">	12</w:t>
       </w:r>
@@ -378,23 +379,23 @@
     <w:p>
       <w:pPr>
         <w:tabs>
-          <w:tab w:val="right" w:pos="9180" w:leader="dot"/>
+          <w:tab w:val="right" w:pos="9071" w:leader="dot"/>
         </w:tabs>
-        <w:spacing w:after="120" w:line="276"/>
+        <w:spacing w:after="120" w:line="360"/>
       </w:pPr>
       <w:r>
         <w:rPr>
           <w:color w:val="1F2937"/>
-          <w:sz w:val="22"/>
-          <w:szCs w:val="22"/>
-        </w:rPr>
-        <w:t xml:space="preserve">9. Repositório de Erros e Correção</w:t>
+          <w:sz w:val="24"/>
+          <w:szCs w:val="24"/>
+        </w:rPr>
+        <w:t xml:space="preserve">9 Repositório de Erros e Correção</w:t>
       </w:r>
       <w:r>
         <w:rPr>
           <w:color w:val="1F2937"/>
-          <w:sz w:val="22"/>
-          <w:szCs w:val="22"/>
+          <w:sz w:val="24"/>
+          <w:szCs w:val="24"/>
         </w:rPr>
         <w:t xml:space="preserve">	13</w:t>
       </w:r>
@@ -402,23 +403,23 @@
     <w:p>
       <w:pPr>
         <w:tabs>
-          <w:tab w:val="right" w:pos="9180" w:leader="dot"/>
+          <w:tab w:val="right" w:pos="9071" w:leader="dot"/>
         </w:tabs>
-        <w:spacing w:after="120" w:line="276"/>
+        <w:spacing w:after="120" w:line="360"/>
       </w:pPr>
       <w:r>
         <w:rPr>
           <w:color w:val="1F2937"/>
-          <w:sz w:val="22"/>
-          <w:szCs w:val="22"/>
-        </w:rPr>
-        <w:t xml:space="preserve">10. Fluxos de Inteligência Artificial</w:t>
+          <w:sz w:val="24"/>
+          <w:szCs w:val="24"/>
+        </w:rPr>
+        <w:t xml:space="preserve">10 Fluxos de Inteligência Artificial</w:t>
       </w:r>
       <w:r>
         <w:rPr>
           <w:color w:val="1F2937"/>
-          <w:sz w:val="22"/>
-          <w:szCs w:val="22"/>
+          <w:sz w:val="24"/>
+          <w:szCs w:val="24"/>
         </w:rPr>
         <w:t xml:space="preserve">	14</w:t>
       </w:r>
@@ -426,23 +427,23 @@
     <w:p>
       <w:pPr>
         <w:tabs>
-          <w:tab w:val="right" w:pos="9180" w:leader="dot"/>
+          <w:tab w:val="right" w:pos="9071" w:leader="dot"/>
         </w:tabs>
-        <w:spacing w:after="120" w:line="276"/>
+        <w:spacing w:after="120" w:line="360"/>
       </w:pPr>
       <w:r>
         <w:rPr>
           <w:color w:val="1F2937"/>
-          <w:sz w:val="22"/>
-          <w:szCs w:val="22"/>
-        </w:rPr>
-        <w:t xml:space="preserve">11. Considerações Finais</w:t>
+          <w:sz w:val="24"/>
+          <w:szCs w:val="24"/>
+        </w:rPr>
+        <w:t xml:space="preserve">11 Considerações Finais</w:t>
       </w:r>
       <w:r>
         <w:rPr>
           <w:color w:val="1F2937"/>
-          <w:sz w:val="22"/>
-          <w:szCs w:val="22"/>
+          <w:sz w:val="24"/>
+          <w:szCs w:val="24"/>
         </w:rPr>
         <w:t xml:space="preserve">	15</w:t>
       </w:r>
@@ -455,15 +456,17 @@
     <w:p>
       <w:pPr>
         <w:pStyle w:val="Heading1"/>
-        <w:spacing w:after="160" w:before="320"/>
-      </w:pPr>
-      <w:r>
-        <w:t xml:space="preserve">1. Introdução e Arquitetura-Alvo</w:t>
-      </w:r>
-    </w:p>
-    <w:p>
-      <w:pPr>
-        <w:spacing w:after="120" w:before="0" w:line="276"/>
+        <w:spacing w:after="200" w:before="320" w:line="360"/>
+      </w:pPr>
+      <w:r>
+        <w:t xml:space="preserve">1 INTRODUÇÃO E ARQUITETURA-ALVO</w:t>
+      </w:r>
+    </w:p>
+    <w:p>
+      <w:pPr>
+        <w:spacing w:after="120" w:before="0" w:line="360"/>
+        <w:ind w:firstLine="709"/>
+        <w:jc w:val="both"/>
       </w:pPr>
       <w:r>
         <w:t xml:space="preserve">Este documento descreve a arquitetura-alvo da plataforma Remio sob a ótica de engenharia de software: como o sistema seria estruturado em produção para ser seguro, observável, resiliente e de alta qualidade. Enquanto o protótipo entregue é uma aplicação front-end com dados simulados, esta seção projeta o sistema completo que o sustentaria em escala real, atendendo aos requisitos não funcionais da plataforma.</w:t>
@@ -471,7 +474,9 @@
     </w:p>
     <w:p>
       <w:pPr>
-        <w:spacing w:after="120" w:before="0" w:line="276"/>
+        <w:spacing w:after="120" w:before="0" w:line="360"/>
+        <w:ind w:firstLine="709"/>
+        <w:jc w:val="both"/>
       </w:pPr>
       <w:r>
         <w:t xml:space="preserve">A arquitetura adota uma organização em camadas, com responsabilidades bem separadas e duas camadas transversais — observabilidade e segurança — que permeiam todo o sistema.</w:t>
@@ -479,7 +484,21 @@
     </w:p>
     <w:p>
       <w:pPr>
-        <w:spacing w:after="60" w:before="80"/>
+        <w:spacing w:after="40" w:before="160"/>
+        <w:jc w:val="center"/>
+      </w:pPr>
+      <w:r>
+        <w:rPr>
+          <w:color w:val="1F2937"/>
+          <w:sz w:val="20"/>
+          <w:szCs w:val="20"/>
+        </w:rPr>
+        <w:t xml:space="preserve">Figura 1 — Arquitetura-alvo da plataforma em camadas.</w:t>
+      </w:r>
+    </w:p>
+    <w:p>
+      <w:pPr>
+        <w:spacing w:after="40"/>
         <w:jc w:val="center"/>
       </w:pPr>
       <w:r>
@@ -530,18 +549,18 @@
       </w:pPr>
       <w:r>
         <w:rPr>
-          <w:i/>
-          <w:iCs/>
-          <w:color w:val="6B7280"/>
-          <w:sz w:val="17"/>
-          <w:szCs w:val="17"/>
-        </w:rPr>
-        <w:t xml:space="preserve">Figura 1 — Arquitetura-alvo da plataforma em camadas.</w:t>
-      </w:r>
-    </w:p>
-    <w:p>
-      <w:pPr>
-        <w:spacing w:after="120" w:before="60" w:line="276"/>
+          <w:color w:val="1F2937"/>
+          <w:sz w:val="20"/>
+          <w:szCs w:val="20"/>
+        </w:rPr>
+        <w:t xml:space="preserve">Fonte: elaborado pelos autores (2026).</w:t>
+      </w:r>
+    </w:p>
+    <w:p>
+      <w:pPr>
+        <w:spacing w:after="120" w:before="60" w:line="360"/>
+        <w:ind w:firstLine="709"/>
+        <w:jc w:val="both"/>
       </w:pPr>
       <w:r>
         <w:t xml:space="preserve">As camadas se dividem assim:</w:t>
@@ -554,7 +573,7 @@
           <w:ilvl w:val="0"/>
           <w:numId w:val="2"/>
         </w:numPr>
-        <w:spacing w:after="80" w:line="276"/>
+        <w:spacing w:after="80" w:line="360"/>
       </w:pPr>
       <w:r>
         <w:rPr>
@@ -574,7 +593,7 @@
           <w:ilvl w:val="0"/>
           <w:numId w:val="2"/>
         </w:numPr>
-        <w:spacing w:after="80" w:line="276"/>
+        <w:spacing w:after="80" w:line="360"/>
       </w:pPr>
       <w:r>
         <w:rPr>
@@ -594,7 +613,7 @@
           <w:ilvl w:val="0"/>
           <w:numId w:val="2"/>
         </w:numPr>
-        <w:spacing w:after="80" w:line="276"/>
+        <w:spacing w:after="80" w:line="360"/>
       </w:pPr>
       <w:r>
         <w:rPr>
@@ -614,7 +633,7 @@
           <w:ilvl w:val="0"/>
           <w:numId w:val="2"/>
         </w:numPr>
-        <w:spacing w:after="80" w:line="276"/>
+        <w:spacing w:after="80" w:line="360"/>
       </w:pPr>
       <w:r>
         <w:rPr>
@@ -634,7 +653,7 @@
           <w:ilvl w:val="0"/>
           <w:numId w:val="2"/>
         </w:numPr>
-        <w:spacing w:after="80" w:line="276"/>
+        <w:spacing w:after="80" w:line="360"/>
       </w:pPr>
       <w:r>
         <w:rPr>
@@ -655,15 +674,17 @@
     <w:p>
       <w:pPr>
         <w:pStyle w:val="Heading1"/>
-        <w:spacing w:after="160" w:before="320"/>
-      </w:pPr>
-      <w:r>
-        <w:t xml:space="preserve">2. Estilo Arquitetural: Monólito Modular e Microsserviços</w:t>
-      </w:r>
-    </w:p>
-    <w:p>
-      <w:pPr>
-        <w:spacing w:after="120" w:before="0" w:line="276"/>
+        <w:spacing w:after="200" w:before="320" w:line="360"/>
+      </w:pPr>
+      <w:r>
+        <w:t xml:space="preserve">2 ESTILO ARQUITETURAL: MONÓLITO MODULAR E MICROSSERVIÇOS</w:t>
+      </w:r>
+    </w:p>
+    <w:p>
+      <w:pPr>
+        <w:spacing w:after="120" w:before="0" w:line="360"/>
+        <w:ind w:firstLine="709"/>
+        <w:jc w:val="both"/>
       </w:pPr>
       <w:r>
         <w:t xml:space="preserve">Uma decisão central de arquitetura é escolher entre um monólito (aplicação única) e microsserviços (vários serviços independentes). A Remio adota uma estratégia evolutiva, adequada ao estágio do negócio.</w:t>
@@ -671,7 +692,7 @@
     </w:p>
     <w:tbl>
       <w:tblPr>
-        <w:tblW w:type="dxa" w:w="9360"/>
+        <w:tblW w:type="dxa" w:w="9071"/>
         <w:tblBorders>
           <w:top w:val="single" w:color="auto" w:sz="4"/>
           <w:left w:val="single" w:color="auto" w:sz="4"/>
@@ -682,9 +703,9 @@
         </w:tblBorders>
       </w:tblPr>
       <w:tblGrid>
-        <w:gridCol w:w="2400"/>
-        <w:gridCol w:w="4060"/>
-        <w:gridCol w:w="2900"/>
+        <w:gridCol w:w="2326"/>
+        <w:gridCol w:w="3935"/>
+        <w:gridCol w:w="2810"/>
       </w:tblGrid>
       <w:tr>
         <w:trPr>
@@ -692,7 +713,7 @@
         </w:trPr>
         <w:tc>
           <w:tcPr>
-            <w:tcW w:type="dxa" w:w="2400"/>
+            <w:tcW w:type="dxa" w:w="2326"/>
             <w:tcBorders>
               <w:top w:val="single" w:color="CCCCCC" w:sz="1"/>
               <w:left w:val="single" w:color="CCCCCC" w:sz="1"/>
@@ -723,7 +744,7 @@
         </w:tc>
         <w:tc>
           <w:tcPr>
-            <w:tcW w:type="dxa" w:w="4060"/>
+            <w:tcW w:type="dxa" w:w="3935"/>
             <w:tcBorders>
               <w:top w:val="single" w:color="CCCCCC" w:sz="1"/>
               <w:left w:val="single" w:color="CCCCCC" w:sz="1"/>
@@ -754,7 +775,7 @@
         </w:tc>
         <w:tc>
           <w:tcPr>
-            <w:tcW w:type="dxa" w:w="2900"/>
+            <w:tcW w:type="dxa" w:w="2810"/>
             <w:tcBorders>
               <w:top w:val="single" w:color="CCCCCC" w:sz="1"/>
               <w:left w:val="single" w:color="CCCCCC" w:sz="1"/>
@@ -787,7 +808,7 @@
       <w:tr>
         <w:tc>
           <w:tcPr>
-            <w:tcW w:type="dxa" w:w="2400"/>
+            <w:tcW w:type="dxa" w:w="2326"/>
             <w:tcBorders>
               <w:top w:val="single" w:color="CCCCCC" w:sz="1"/>
               <w:left w:val="single" w:color="CCCCCC" w:sz="1"/>
@@ -815,7 +836,7 @@
         </w:tc>
         <w:tc>
           <w:tcPr>
-            <w:tcW w:type="dxa" w:w="4060"/>
+            <w:tcW w:type="dxa" w:w="3935"/>
             <w:tcBorders>
               <w:top w:val="single" w:color="CCCCCC" w:sz="1"/>
               <w:left w:val="single" w:color="CCCCCC" w:sz="1"/>
@@ -843,7 +864,7 @@
         </w:tc>
         <w:tc>
           <w:tcPr>
-            <w:tcW w:type="dxa" w:w="2900"/>
+            <w:tcW w:type="dxa" w:w="2810"/>
             <w:tcBorders>
               <w:top w:val="single" w:color="CCCCCC" w:sz="1"/>
               <w:left w:val="single" w:color="CCCCCC" w:sz="1"/>
@@ -873,7 +894,7 @@
       <w:tr>
         <w:tc>
           <w:tcPr>
-            <w:tcW w:type="dxa" w:w="2400"/>
+            <w:tcW w:type="dxa" w:w="2326"/>
             <w:tcBorders>
               <w:top w:val="single" w:color="CCCCCC" w:sz="1"/>
               <w:left w:val="single" w:color="CCCCCC" w:sz="1"/>
@@ -902,7 +923,7 @@
         </w:tc>
         <w:tc>
           <w:tcPr>
-            <w:tcW w:type="dxa" w:w="4060"/>
+            <w:tcW w:type="dxa" w:w="3935"/>
             <w:tcBorders>
               <w:top w:val="single" w:color="CCCCCC" w:sz="1"/>
               <w:left w:val="single" w:color="CCCCCC" w:sz="1"/>
@@ -931,7 +952,7 @@
         </w:tc>
         <w:tc>
           <w:tcPr>
-            <w:tcW w:type="dxa" w:w="2900"/>
+            <w:tcW w:type="dxa" w:w="2810"/>
             <w:tcBorders>
               <w:top w:val="single" w:color="CCCCCC" w:sz="1"/>
               <w:left w:val="single" w:color="CCCCCC" w:sz="1"/>
@@ -962,7 +983,9 @@
     </w:tbl>
     <w:p>
       <w:pPr>
-        <w:spacing w:after="120" w:before="80" w:line="276"/>
+        <w:spacing w:after="120" w:before="80" w:line="360"/>
+        <w:ind w:firstLine="709"/>
+        <w:jc w:val="both"/>
       </w:pPr>
       <w:r>
         <w:rPr>
@@ -977,7 +1000,9 @@
     </w:p>
     <w:p>
       <w:pPr>
-        <w:spacing w:after="120" w:before="0" w:line="276"/>
+        <w:spacing w:after="120" w:before="0" w:line="360"/>
+        <w:ind w:firstLine="709"/>
+        <w:jc w:val="both"/>
       </w:pPr>
       <w:r>
         <w:t xml:space="preserve">Essa decisão dialoga diretamente com o plano de negócios, que projeta uma empresa em formação e crescimento gradual: a arquitetura acompanha a maturidade da operação.</w:t>
@@ -991,15 +1016,17 @@
     <w:p>
       <w:pPr>
         <w:pStyle w:val="Heading1"/>
-        <w:spacing w:after="160" w:before="320"/>
-      </w:pPr>
-      <w:r>
-        <w:t xml:space="preserve">3. Segurança em Camadas</w:t>
-      </w:r>
-    </w:p>
-    <w:p>
-      <w:pPr>
-        <w:spacing w:after="120" w:before="0" w:line="276"/>
+        <w:spacing w:after="200" w:before="320" w:line="360"/>
+      </w:pPr>
+      <w:r>
+        <w:t xml:space="preserve">3 SEGURANÇA EM CAMADAS</w:t>
+      </w:r>
+    </w:p>
+    <w:p>
+      <w:pPr>
+        <w:spacing w:after="120" w:before="0" w:line="360"/>
+        <w:ind w:firstLine="709"/>
+        <w:jc w:val="both"/>
       </w:pPr>
       <w:r>
         <w:t xml:space="preserve">A segurança da Remio segue o princípio de defesa em profundidade (defense in depth): em vez de uma única barreira, várias camadas de proteção se sobrepõem, de modo que a falha de uma não comprometa todo o sistema.</w:t>
@@ -1007,7 +1034,21 @@
     </w:p>
     <w:p>
       <w:pPr>
-        <w:spacing w:after="60" w:before="80"/>
+        <w:spacing w:after="40" w:before="160"/>
+        <w:jc w:val="center"/>
+      </w:pPr>
+      <w:r>
+        <w:rPr>
+          <w:color w:val="1F2937"/>
+          <w:sz w:val="20"/>
+          <w:szCs w:val="20"/>
+        </w:rPr>
+        <w:t xml:space="preserve">Figura 2 — Defesa em profundidade: quatro camadas de segurança.</w:t>
+      </w:r>
+    </w:p>
+    <w:p>
+      <w:pPr>
+        <w:spacing w:after="40"/>
         <w:jc w:val="center"/>
       </w:pPr>
       <w:r>
@@ -1058,18 +1099,18 @@
       </w:pPr>
       <w:r>
         <w:rPr>
-          <w:i/>
-          <w:iCs/>
-          <w:color w:val="6B7280"/>
-          <w:sz w:val="17"/>
-          <w:szCs w:val="17"/>
-        </w:rPr>
-        <w:t xml:space="preserve">Figura 2 — Defesa em profundidade: quatro camadas de segurança.</w:t>
-      </w:r>
-    </w:p>
-    <w:p>
-      <w:pPr>
-        <w:spacing w:after="120" w:before="60" w:line="276"/>
+          <w:color w:val="1F2937"/>
+          <w:sz w:val="20"/>
+          <w:szCs w:val="20"/>
+        </w:rPr>
+        <w:t xml:space="preserve">Fonte: elaborado pelos autores (2026).</w:t>
+      </w:r>
+    </w:p>
+    <w:p>
+      <w:pPr>
+        <w:spacing w:after="120" w:before="60" w:line="360"/>
+        <w:ind w:firstLine="709"/>
+        <w:jc w:val="both"/>
       </w:pPr>
       <w:r>
         <w:t xml:space="preserve">Cada camada cumpre um papel:</w:t>
@@ -1082,7 +1123,7 @@
           <w:ilvl w:val="0"/>
           <w:numId w:val="2"/>
         </w:numPr>
-        <w:spacing w:after="80" w:line="276"/>
+        <w:spacing w:after="80" w:line="360"/>
       </w:pPr>
       <w:r>
         <w:rPr>
@@ -1102,7 +1143,7 @@
           <w:ilvl w:val="0"/>
           <w:numId w:val="2"/>
         </w:numPr>
-        <w:spacing w:after="80" w:line="276"/>
+        <w:spacing w:after="80" w:line="360"/>
       </w:pPr>
       <w:r>
         <w:rPr>
@@ -1122,7 +1163,7 @@
           <w:ilvl w:val="0"/>
           <w:numId w:val="2"/>
         </w:numPr>
-        <w:spacing w:after="80" w:line="276"/>
+        <w:spacing w:after="80" w:line="360"/>
       </w:pPr>
       <w:r>
         <w:rPr>
@@ -1142,7 +1183,7 @@
           <w:ilvl w:val="0"/>
           <w:numId w:val="2"/>
         </w:numPr>
-        <w:spacing w:after="80" w:line="276"/>
+        <w:spacing w:after="80" w:line="360"/>
       </w:pPr>
       <w:r>
         <w:rPr>
@@ -1158,15 +1199,17 @@
     <w:p>
       <w:pPr>
         <w:pStyle w:val="Heading2"/>
-        <w:spacing w:after="120" w:before="240"/>
-      </w:pPr>
-      <w:r>
-        <w:t xml:space="preserve">3.1. Proteção contra SQL Injection</w:t>
-      </w:r>
-    </w:p>
-    <w:p>
-      <w:pPr>
-        <w:spacing w:after="120" w:before="0" w:line="276"/>
+        <w:spacing w:after="120" w:before="240" w:line="360"/>
+      </w:pPr>
+      <w:r>
+        <w:t xml:space="preserve">3.1 Proteção contra SQL Injection</w:t>
+      </w:r>
+    </w:p>
+    <w:p>
+      <w:pPr>
+        <w:spacing w:after="120" w:before="0" w:line="360"/>
+        <w:ind w:firstLine="709"/>
+        <w:jc w:val="both"/>
       </w:pPr>
       <w:r>
         <w:t xml:space="preserve">O SQL injection é um dos ataques mais comuns: o atacante insere comandos SQL em campos de entrada para manipular a consulta. A defesa definitiva são as queries parametrizadas (prepared statements), nas quais os dados do usuário nunca são interpretados como código. O contraste abaixo ilustra o problema e a solução.</w:t>
@@ -1174,7 +1217,9 @@
     </w:p>
     <w:p>
       <w:pPr>
-        <w:spacing w:after="80" w:before="0" w:line="276"/>
+        <w:spacing w:after="80" w:before="0" w:line="360"/>
+        <w:ind w:firstLine="709"/>
+        <w:jc w:val="both"/>
       </w:pPr>
       <w:r>
         <w:rPr>
@@ -1189,7 +1234,7 @@
     </w:p>
     <w:tbl>
       <w:tblPr>
-        <w:tblW w:type="dxa" w:w="9360"/>
+        <w:tblW w:type="dxa" w:w="9071"/>
         <w:tblBorders>
           <w:top w:val="single" w:color="auto" w:sz="4"/>
           <w:left w:val="single" w:color="auto" w:sz="4"/>
@@ -1200,12 +1245,12 @@
         </w:tblBorders>
       </w:tblPr>
       <w:tblGrid>
-        <w:gridCol w:w="9360"/>
+        <w:gridCol w:w="9071"/>
       </w:tblGrid>
       <w:tr>
         <w:tc>
           <w:tcPr>
-            <w:tcW w:type="dxa" w:w="9360"/>
+            <w:tcW w:type="dxa" w:w="9071"/>
             <w:tcBorders>
               <w:top w:val="single" w:color="CCCCCC" w:sz="1"/>
               <w:left w:val="single" w:color="CCCCCC" w:sz="1"/>
@@ -1309,7 +1354,9 @@
     </w:tbl>
     <w:p>
       <w:pPr>
-        <w:spacing w:after="80" w:before="100" w:line="276"/>
+        <w:spacing w:after="80" w:before="100" w:line="360"/>
+        <w:ind w:firstLine="709"/>
+        <w:jc w:val="both"/>
       </w:pPr>
       <w:r>
         <w:rPr>
@@ -1324,7 +1371,7 @@
     </w:p>
     <w:tbl>
       <w:tblPr>
-        <w:tblW w:type="dxa" w:w="9360"/>
+        <w:tblW w:type="dxa" w:w="9071"/>
         <w:tblBorders>
           <w:top w:val="single" w:color="auto" w:sz="4"/>
           <w:left w:val="single" w:color="auto" w:sz="4"/>
@@ -1335,12 +1382,12 @@
         </w:tblBorders>
       </w:tblPr>
       <w:tblGrid>
-        <w:gridCol w:w="9360"/>
+        <w:gridCol w:w="9071"/>
       </w:tblGrid>
       <w:tr>
         <w:tc>
           <w:tcPr>
-            <w:tcW w:type="dxa" w:w="9360"/>
+            <w:tcW w:type="dxa" w:w="9071"/>
             <w:tcBorders>
               <w:top w:val="single" w:color="CCCCCC" w:sz="1"/>
               <w:left w:val="single" w:color="CCCCCC" w:sz="1"/>
@@ -1444,7 +1491,9 @@
     </w:tbl>
     <w:p>
       <w:pPr>
-        <w:spacing w:after="120" w:before="80" w:line="276"/>
+        <w:spacing w:after="120" w:before="80" w:line="360"/>
+        <w:ind w:firstLine="709"/>
+        <w:jc w:val="both"/>
       </w:pPr>
       <w:r>
         <w:t xml:space="preserve">Os exemplos de consulta do documento de Engenharia de Dados já seguem esse padrão, usando parâmetros nomeados (por exemplo, :id) em vez de concatenar valores.</w:t>
@@ -1458,15 +1507,17 @@
     <w:p>
       <w:pPr>
         <w:pStyle w:val="Heading1"/>
-        <w:spacing w:after="160" w:before="320"/>
-      </w:pPr>
-      <w:r>
-        <w:t xml:space="preserve">4. Observabilidade</w:t>
-      </w:r>
-    </w:p>
-    <w:p>
-      <w:pPr>
-        <w:spacing w:after="120" w:before="0" w:line="276"/>
+        <w:spacing w:after="200" w:before="320" w:line="360"/>
+      </w:pPr>
+      <w:r>
+        <w:t xml:space="preserve">4 OBSERVABILIDADE</w:t>
+      </w:r>
+    </w:p>
+    <w:p>
+      <w:pPr>
+        <w:spacing w:after="120" w:before="0" w:line="360"/>
+        <w:ind w:firstLine="709"/>
+        <w:jc w:val="both"/>
       </w:pPr>
       <w:r>
         <w:t xml:space="preserve">Observabilidade é a capacidade de entender o que acontece dentro do sistema a partir do que ele emite. Vai além do monitoramento tradicional: permite identificar automaticamente padrões, gargalos e oportunidades de melhoria — exatamente o tipo de análise que o orientador destacou. Apoia-se em três pilares.</w:t>
@@ -1474,7 +1525,21 @@
     </w:p>
     <w:p>
       <w:pPr>
-        <w:spacing w:after="60" w:before="80"/>
+        <w:spacing w:after="40" w:before="160"/>
+        <w:jc w:val="center"/>
+      </w:pPr>
+      <w:r>
+        <w:rPr>
+          <w:color w:val="1F2937"/>
+          <w:sz w:val="20"/>
+          <w:szCs w:val="20"/>
+        </w:rPr>
+        <w:t xml:space="preserve">Figura 3 — Os três pilares da observabilidade e o fluxo até alertas e IA.</w:t>
+      </w:r>
+    </w:p>
+    <w:p>
+      <w:pPr>
+        <w:spacing w:after="40"/>
         <w:jc w:val="center"/>
       </w:pPr>
       <w:r>
@@ -1525,18 +1590,16 @@
       </w:pPr>
       <w:r>
         <w:rPr>
-          <w:i/>
-          <w:iCs/>
-          <w:color w:val="6B7280"/>
-          <w:sz w:val="17"/>
-          <w:szCs w:val="17"/>
-        </w:rPr>
-        <w:t xml:space="preserve">Figura 3 — Os três pilares da observabilidade e o fluxo até alertas e IA.</w:t>
+          <w:color w:val="1F2937"/>
+          <w:sz w:val="20"/>
+          <w:szCs w:val="20"/>
+        </w:rPr>
+        <w:t xml:space="preserve">Fonte: elaborado pelos autores (2026).</w:t>
       </w:r>
     </w:p>
     <w:tbl>
       <w:tblPr>
-        <w:tblW w:type="dxa" w:w="9360"/>
+        <w:tblW w:type="dxa" w:w="9071"/>
         <w:tblBorders>
           <w:top w:val="single" w:color="auto" w:sz="4"/>
           <w:left w:val="single" w:color="auto" w:sz="4"/>
@@ -1547,9 +1610,9 @@
         </w:tblBorders>
       </w:tblPr>
       <w:tblGrid>
-        <w:gridCol w:w="1700"/>
-        <w:gridCol w:w="4360"/>
-        <w:gridCol w:w="3300"/>
+        <w:gridCol w:w="1648"/>
+        <w:gridCol w:w="4225"/>
+        <w:gridCol w:w="3198"/>
       </w:tblGrid>
       <w:tr>
         <w:trPr>
@@ -1557,7 +1620,7 @@
         </w:trPr>
         <w:tc>
           <w:tcPr>
-            <w:tcW w:type="dxa" w:w="1700"/>
+            <w:tcW w:type="dxa" w:w="1648"/>
             <w:tcBorders>
               <w:top w:val="single" w:color="CCCCCC" w:sz="1"/>
               <w:left w:val="single" w:color="CCCCCC" w:sz="1"/>
@@ -1588,7 +1651,7 @@
         </w:tc>
         <w:tc>
           <w:tcPr>
-            <w:tcW w:type="dxa" w:w="4360"/>
+            <w:tcW w:type="dxa" w:w="4225"/>
             <w:tcBorders>
               <w:top w:val="single" w:color="CCCCCC" w:sz="1"/>
               <w:left w:val="single" w:color="CCCCCC" w:sz="1"/>
@@ -1619,7 +1682,7 @@
         </w:tc>
         <w:tc>
           <w:tcPr>
-            <w:tcW w:type="dxa" w:w="3300"/>
+            <w:tcW w:type="dxa" w:w="3198"/>
             <w:tcBorders>
               <w:top w:val="single" w:color="CCCCCC" w:sz="1"/>
               <w:left w:val="single" w:color="CCCCCC" w:sz="1"/>
@@ -1652,7 +1715,7 @@
       <w:tr>
         <w:tc>
           <w:tcPr>
-            <w:tcW w:type="dxa" w:w="1700"/>
+            <w:tcW w:type="dxa" w:w="1648"/>
             <w:tcBorders>
               <w:top w:val="single" w:color="CCCCCC" w:sz="1"/>
               <w:left w:val="single" w:color="CCCCCC" w:sz="1"/>
@@ -1680,7 +1743,7 @@
         </w:tc>
         <w:tc>
           <w:tcPr>
-            <w:tcW w:type="dxa" w:w="4360"/>
+            <w:tcW w:type="dxa" w:w="4225"/>
             <w:tcBorders>
               <w:top w:val="single" w:color="CCCCCC" w:sz="1"/>
               <w:left w:val="single" w:color="CCCCCC" w:sz="1"/>
@@ -1708,7 +1771,7 @@
         </w:tc>
         <w:tc>
           <w:tcPr>
-            <w:tcW w:type="dxa" w:w="3300"/>
+            <w:tcW w:type="dxa" w:w="3198"/>
             <w:tcBorders>
               <w:top w:val="single" w:color="CCCCCC" w:sz="1"/>
               <w:left w:val="single" w:color="CCCCCC" w:sz="1"/>
@@ -1738,7 +1801,7 @@
       <w:tr>
         <w:tc>
           <w:tcPr>
-            <w:tcW w:type="dxa" w:w="1700"/>
+            <w:tcW w:type="dxa" w:w="1648"/>
             <w:tcBorders>
               <w:top w:val="single" w:color="CCCCCC" w:sz="1"/>
               <w:left w:val="single" w:color="CCCCCC" w:sz="1"/>
@@ -1767,7 +1830,7 @@
         </w:tc>
         <w:tc>
           <w:tcPr>
-            <w:tcW w:type="dxa" w:w="4360"/>
+            <w:tcW w:type="dxa" w:w="4225"/>
             <w:tcBorders>
               <w:top w:val="single" w:color="CCCCCC" w:sz="1"/>
               <w:left w:val="single" w:color="CCCCCC" w:sz="1"/>
@@ -1796,7 +1859,7 @@
         </w:tc>
         <w:tc>
           <w:tcPr>
-            <w:tcW w:type="dxa" w:w="3300"/>
+            <w:tcW w:type="dxa" w:w="3198"/>
             <w:tcBorders>
               <w:top w:val="single" w:color="CCCCCC" w:sz="1"/>
               <w:left w:val="single" w:color="CCCCCC" w:sz="1"/>
@@ -1827,7 +1890,7 @@
       <w:tr>
         <w:tc>
           <w:tcPr>
-            <w:tcW w:type="dxa" w:w="1700"/>
+            <w:tcW w:type="dxa" w:w="1648"/>
             <w:tcBorders>
               <w:top w:val="single" w:color="CCCCCC" w:sz="1"/>
               <w:left w:val="single" w:color="CCCCCC" w:sz="1"/>
@@ -1855,7 +1918,7 @@
         </w:tc>
         <w:tc>
           <w:tcPr>
-            <w:tcW w:type="dxa" w:w="4360"/>
+            <w:tcW w:type="dxa" w:w="4225"/>
             <w:tcBorders>
               <w:top w:val="single" w:color="CCCCCC" w:sz="1"/>
               <w:left w:val="single" w:color="CCCCCC" w:sz="1"/>
@@ -1883,7 +1946,7 @@
         </w:tc>
         <w:tc>
           <w:tcPr>
-            <w:tcW w:type="dxa" w:w="3300"/>
+            <w:tcW w:type="dxa" w:w="3198"/>
             <w:tcBorders>
               <w:top w:val="single" w:color="CCCCCC" w:sz="1"/>
               <w:left w:val="single" w:color="CCCCCC" w:sz="1"/>
@@ -1913,7 +1976,9 @@
     </w:tbl>
     <w:p>
       <w:pPr>
-        <w:spacing w:after="120" w:before="80" w:line="276"/>
+        <w:spacing w:after="120" w:before="80" w:line="360"/>
+        <w:ind w:firstLine="709"/>
+        <w:jc w:val="both"/>
       </w:pPr>
       <w:r>
         <w:t xml:space="preserve">Os três sinais são coletados por um agente padronizado (OpenTelemetry), armazenados (Prometheus para métricas, Loki para logs) e visualizados em dashboards (Grafana). Sobre essa base atuam os alertas automáticos (por exemplo, "latência acima de 2s" ou "taxa de erro subindo") e uma camada de detecção de anomalias com IA, capaz de apontar padrões e sugerir melhorias sem intervenção manual.</w:t>
@@ -1927,15 +1992,17 @@
     <w:p>
       <w:pPr>
         <w:pStyle w:val="Heading1"/>
-        <w:spacing w:after="160" w:before="320"/>
-      </w:pPr>
-      <w:r>
-        <w:t xml:space="preserve">5. Resiliência do Software</w:t>
-      </w:r>
-    </w:p>
-    <w:p>
-      <w:pPr>
-        <w:spacing w:after="120" w:before="0" w:line="276"/>
+        <w:spacing w:after="200" w:before="320" w:line="360"/>
+      </w:pPr>
+      <w:r>
+        <w:t xml:space="preserve">5 RESILIÊNCIA DO SOFTWARE</w:t>
+      </w:r>
+    </w:p>
+    <w:p>
+      <w:pPr>
+        <w:spacing w:after="120" w:before="0" w:line="360"/>
+        <w:ind w:firstLine="709"/>
+        <w:jc w:val="both"/>
       </w:pPr>
       <w:r>
         <w:t xml:space="preserve">Resiliência é a capacidade do sistema de continuar funcionando — ou degradar de forma controlada — diante de falhas. Em vez de supor que tudo sempre funciona, projeta-se para a falha. Os principais padrões adotados:</w:t>
@@ -1943,7 +2010,7 @@
     </w:p>
     <w:tbl>
       <w:tblPr>
-        <w:tblW w:type="dxa" w:w="9360"/>
+        <w:tblW w:type="dxa" w:w="9071"/>
         <w:tblBorders>
           <w:top w:val="single" w:color="auto" w:sz="4"/>
           <w:left w:val="single" w:color="auto" w:sz="4"/>
@@ -1954,8 +2021,8 @@
         </w:tblBorders>
       </w:tblPr>
       <w:tblGrid>
-        <w:gridCol w:w="2400"/>
-        <w:gridCol w:w="6960"/>
+        <w:gridCol w:w="2326"/>
+        <w:gridCol w:w="6745"/>
       </w:tblGrid>
       <w:tr>
         <w:trPr>
@@ -1963,7 +2030,7 @@
         </w:trPr>
         <w:tc>
           <w:tcPr>
-            <w:tcW w:type="dxa" w:w="2400"/>
+            <w:tcW w:type="dxa" w:w="2326"/>
             <w:tcBorders>
               <w:top w:val="single" w:color="CCCCCC" w:sz="1"/>
               <w:left w:val="single" w:color="CCCCCC" w:sz="1"/>
@@ -1994,7 +2061,7 @@
         </w:tc>
         <w:tc>
           <w:tcPr>
-            <w:tcW w:type="dxa" w:w="6960"/>
+            <w:tcW w:type="dxa" w:w="6745"/>
             <w:tcBorders>
               <w:top w:val="single" w:color="CCCCCC" w:sz="1"/>
               <w:left w:val="single" w:color="CCCCCC" w:sz="1"/>
@@ -2027,7 +2094,7 @@
       <w:tr>
         <w:tc>
           <w:tcPr>
-            <w:tcW w:type="dxa" w:w="2400"/>
+            <w:tcW w:type="dxa" w:w="2326"/>
             <w:tcBorders>
               <w:top w:val="single" w:color="CCCCCC" w:sz="1"/>
               <w:left w:val="single" w:color="CCCCCC" w:sz="1"/>
@@ -2055,7 +2122,7 @@
         </w:tc>
         <w:tc>
           <w:tcPr>
-            <w:tcW w:type="dxa" w:w="6960"/>
+            <w:tcW w:type="dxa" w:w="6745"/>
             <w:tcBorders>
               <w:top w:val="single" w:color="CCCCCC" w:sz="1"/>
               <w:left w:val="single" w:color="CCCCCC" w:sz="1"/>
@@ -2085,7 +2152,7 @@
       <w:tr>
         <w:tc>
           <w:tcPr>
-            <w:tcW w:type="dxa" w:w="2400"/>
+            <w:tcW w:type="dxa" w:w="2326"/>
             <w:tcBorders>
               <w:top w:val="single" w:color="CCCCCC" w:sz="1"/>
               <w:left w:val="single" w:color="CCCCCC" w:sz="1"/>
@@ -2114,7 +2181,7 @@
         </w:tc>
         <w:tc>
           <w:tcPr>
-            <w:tcW w:type="dxa" w:w="6960"/>
+            <w:tcW w:type="dxa" w:w="6745"/>
             <w:tcBorders>
               <w:top w:val="single" w:color="CCCCCC" w:sz="1"/>
               <w:left w:val="single" w:color="CCCCCC" w:sz="1"/>
@@ -2145,7 +2212,7 @@
       <w:tr>
         <w:tc>
           <w:tcPr>
-            <w:tcW w:type="dxa" w:w="2400"/>
+            <w:tcW w:type="dxa" w:w="2326"/>
             <w:tcBorders>
               <w:top w:val="single" w:color="CCCCCC" w:sz="1"/>
               <w:left w:val="single" w:color="CCCCCC" w:sz="1"/>
@@ -2173,7 +2240,7 @@
         </w:tc>
         <w:tc>
           <w:tcPr>
-            <w:tcW w:type="dxa" w:w="6960"/>
+            <w:tcW w:type="dxa" w:w="6745"/>
             <w:tcBorders>
               <w:top w:val="single" w:color="CCCCCC" w:sz="1"/>
               <w:left w:val="single" w:color="CCCCCC" w:sz="1"/>
@@ -2203,7 +2270,7 @@
       <w:tr>
         <w:tc>
           <w:tcPr>
-            <w:tcW w:type="dxa" w:w="2400"/>
+            <w:tcW w:type="dxa" w:w="2326"/>
             <w:tcBorders>
               <w:top w:val="single" w:color="CCCCCC" w:sz="1"/>
               <w:left w:val="single" w:color="CCCCCC" w:sz="1"/>
@@ -2232,7 +2299,7 @@
         </w:tc>
         <w:tc>
           <w:tcPr>
-            <w:tcW w:type="dxa" w:w="6960"/>
+            <w:tcW w:type="dxa" w:w="6745"/>
             <w:tcBorders>
               <w:top w:val="single" w:color="CCCCCC" w:sz="1"/>
               <w:left w:val="single" w:color="CCCCCC" w:sz="1"/>
@@ -2263,7 +2330,7 @@
       <w:tr>
         <w:tc>
           <w:tcPr>
-            <w:tcW w:type="dxa" w:w="2400"/>
+            <w:tcW w:type="dxa" w:w="2326"/>
             <w:tcBorders>
               <w:top w:val="single" w:color="CCCCCC" w:sz="1"/>
               <w:left w:val="single" w:color="CCCCCC" w:sz="1"/>
@@ -2291,7 +2358,7 @@
         </w:tc>
         <w:tc>
           <w:tcPr>
-            <w:tcW w:type="dxa" w:w="6960"/>
+            <w:tcW w:type="dxa" w:w="6745"/>
             <w:tcBorders>
               <w:top w:val="single" w:color="CCCCCC" w:sz="1"/>
               <w:left w:val="single" w:color="CCCCCC" w:sz="1"/>
@@ -2321,7 +2388,7 @@
       <w:tr>
         <w:tc>
           <w:tcPr>
-            <w:tcW w:type="dxa" w:w="2400"/>
+            <w:tcW w:type="dxa" w:w="2326"/>
             <w:tcBorders>
               <w:top w:val="single" w:color="CCCCCC" w:sz="1"/>
               <w:left w:val="single" w:color="CCCCCC" w:sz="1"/>
@@ -2350,7 +2417,7 @@
         </w:tc>
         <w:tc>
           <w:tcPr>
-            <w:tcW w:type="dxa" w:w="6960"/>
+            <w:tcW w:type="dxa" w:w="6745"/>
             <w:tcBorders>
               <w:top w:val="single" w:color="CCCCCC" w:sz="1"/>
               <w:left w:val="single" w:color="CCCCCC" w:sz="1"/>
@@ -2381,7 +2448,9 @@
     </w:tbl>
     <w:p>
       <w:pPr>
-        <w:spacing w:after="120" w:before="80" w:line="276"/>
+        <w:spacing w:after="120" w:before="80" w:line="360"/>
+        <w:ind w:firstLine="709"/>
+        <w:jc w:val="both"/>
       </w:pPr>
       <w:r>
         <w:t xml:space="preserve">Esses padrões são medidos por metas de nível de serviço (SLO — Service Level Objectives), como "99,5% de disponibilidade mensal", que orientam tanto o desenvolvimento quanto os alertas de observabilidade.</w:t>
@@ -2395,15 +2464,17 @@
     <w:p>
       <w:pPr>
         <w:pStyle w:val="Heading1"/>
-        <w:spacing w:after="160" w:before="320"/>
-      </w:pPr>
-      <w:r>
-        <w:t xml:space="preserve">6. Gestão de Backups e Recuperação de Desastres</w:t>
-      </w:r>
-    </w:p>
-    <w:p>
-      <w:pPr>
-        <w:spacing w:after="120" w:before="0" w:line="276"/>
+        <w:spacing w:after="200" w:before="320" w:line="360"/>
+      </w:pPr>
+      <w:r>
+        <w:t xml:space="preserve">6 GESTÃO DE BACKUPS E RECUPERAÇÃO DE DESASTRES</w:t>
+      </w:r>
+    </w:p>
+    <w:p>
+      <w:pPr>
+        <w:spacing w:after="120" w:before="0" w:line="360"/>
+        <w:ind w:firstLine="709"/>
+        <w:jc w:val="both"/>
       </w:pPr>
       <w:r>
         <w:t xml:space="preserve">Os dados são o ativo mais crítico da plataforma. A estratégia de backup combina cópias regulares com a capacidade de restaurar o banco a qualquer ponto no tempo, minimizando perdas.</w:t>
@@ -2411,7 +2482,7 @@
     </w:p>
     <w:tbl>
       <w:tblPr>
-        <w:tblW w:type="dxa" w:w="9360"/>
+        <w:tblW w:type="dxa" w:w="9071"/>
         <w:tblBorders>
           <w:top w:val="single" w:color="auto" w:sz="4"/>
           <w:left w:val="single" w:color="auto" w:sz="4"/>
@@ -2422,8 +2493,8 @@
         </w:tblBorders>
       </w:tblPr>
       <w:tblGrid>
-        <w:gridCol w:w="2900"/>
-        <w:gridCol w:w="6460"/>
+        <w:gridCol w:w="2810"/>
+        <w:gridCol w:w="6261"/>
       </w:tblGrid>
       <w:tr>
         <w:trPr>
@@ -2431,7 +2502,7 @@
         </w:trPr>
         <w:tc>
           <w:tcPr>
-            <w:tcW w:type="dxa" w:w="2900"/>
+            <w:tcW w:type="dxa" w:w="2810"/>
             <w:tcBorders>
               <w:top w:val="single" w:color="CCCCCC" w:sz="1"/>
               <w:left w:val="single" w:color="CCCCCC" w:sz="1"/>
@@ -2462,7 +2533,7 @@
         </w:tc>
         <w:tc>
           <w:tcPr>
-            <w:tcW w:type="dxa" w:w="6460"/>
+            <w:tcW w:type="dxa" w:w="6261"/>
             <w:tcBorders>
               <w:top w:val="single" w:color="CCCCCC" w:sz="1"/>
               <w:left w:val="single" w:color="CCCCCC" w:sz="1"/>
@@ -2495,7 +2566,7 @@
       <w:tr>
         <w:tc>
           <w:tcPr>
-            <w:tcW w:type="dxa" w:w="2900"/>
+            <w:tcW w:type="dxa" w:w="2810"/>
             <w:tcBorders>
               <w:top w:val="single" w:color="CCCCCC" w:sz="1"/>
               <w:left w:val="single" w:color="CCCCCC" w:sz="1"/>
@@ -2523,7 +2594,7 @@
         </w:tc>
         <w:tc>
           <w:tcPr>
-            <w:tcW w:type="dxa" w:w="6460"/>
+            <w:tcW w:type="dxa" w:w="6261"/>
             <w:tcBorders>
               <w:top w:val="single" w:color="CCCCCC" w:sz="1"/>
               <w:left w:val="single" w:color="CCCCCC" w:sz="1"/>
@@ -2553,7 +2624,7 @@
       <w:tr>
         <w:tc>
           <w:tcPr>
-            <w:tcW w:type="dxa" w:w="2900"/>
+            <w:tcW w:type="dxa" w:w="2810"/>
             <w:tcBorders>
               <w:top w:val="single" w:color="CCCCCC" w:sz="1"/>
               <w:left w:val="single" w:color="CCCCCC" w:sz="1"/>
@@ -2582,7 +2653,7 @@
         </w:tc>
         <w:tc>
           <w:tcPr>
-            <w:tcW w:type="dxa" w:w="6460"/>
+            <w:tcW w:type="dxa" w:w="6261"/>
             <w:tcBorders>
               <w:top w:val="single" w:color="CCCCCC" w:sz="1"/>
               <w:left w:val="single" w:color="CCCCCC" w:sz="1"/>
@@ -2613,7 +2684,7 @@
       <w:tr>
         <w:tc>
           <w:tcPr>
-            <w:tcW w:type="dxa" w:w="2900"/>
+            <w:tcW w:type="dxa" w:w="2810"/>
             <w:tcBorders>
               <w:top w:val="single" w:color="CCCCCC" w:sz="1"/>
               <w:left w:val="single" w:color="CCCCCC" w:sz="1"/>
@@ -2641,7 +2712,7 @@
         </w:tc>
         <w:tc>
           <w:tcPr>
-            <w:tcW w:type="dxa" w:w="6460"/>
+            <w:tcW w:type="dxa" w:w="6261"/>
             <w:tcBorders>
               <w:top w:val="single" w:color="CCCCCC" w:sz="1"/>
               <w:left w:val="single" w:color="CCCCCC" w:sz="1"/>
@@ -2671,7 +2742,7 @@
       <w:tr>
         <w:tc>
           <w:tcPr>
-            <w:tcW w:type="dxa" w:w="2900"/>
+            <w:tcW w:type="dxa" w:w="2810"/>
             <w:tcBorders>
               <w:top w:val="single" w:color="CCCCCC" w:sz="1"/>
               <w:left w:val="single" w:color="CCCCCC" w:sz="1"/>
@@ -2700,7 +2771,7 @@
         </w:tc>
         <w:tc>
           <w:tcPr>
-            <w:tcW w:type="dxa" w:w="6460"/>
+            <w:tcW w:type="dxa" w:w="6261"/>
             <w:tcBorders>
               <w:top w:val="single" w:color="CCCCCC" w:sz="1"/>
               <w:left w:val="single" w:color="CCCCCC" w:sz="1"/>
@@ -2731,7 +2802,7 @@
       <w:tr>
         <w:tc>
           <w:tcPr>
-            <w:tcW w:type="dxa" w:w="2900"/>
+            <w:tcW w:type="dxa" w:w="2810"/>
             <w:tcBorders>
               <w:top w:val="single" w:color="CCCCCC" w:sz="1"/>
               <w:left w:val="single" w:color="CCCCCC" w:sz="1"/>
@@ -2759,7 +2830,7 @@
         </w:tc>
         <w:tc>
           <w:tcPr>
-            <w:tcW w:type="dxa" w:w="6460"/>
+            <w:tcW w:type="dxa" w:w="6261"/>
             <w:tcBorders>
               <w:top w:val="single" w:color="CCCCCC" w:sz="1"/>
               <w:left w:val="single" w:color="CCCCCC" w:sz="1"/>
@@ -2789,7 +2860,9 @@
     </w:tbl>
     <w:p>
       <w:pPr>
-        <w:spacing w:after="120" w:before="80" w:line="276"/>
+        <w:spacing w:after="120" w:before="80" w:line="360"/>
+        <w:ind w:firstLine="709"/>
+        <w:jc w:val="both"/>
       </w:pPr>
       <w:r>
         <w:t xml:space="preserve">Duas métricas guiam a estratégia: o </w:t>
@@ -2823,15 +2896,17 @@
     <w:p>
       <w:pPr>
         <w:pStyle w:val="Heading1"/>
-        <w:spacing w:after="160" w:before="320"/>
-      </w:pPr>
-      <w:r>
-        <w:t xml:space="preserve">7. Qualidade e Verificação Contínua</w:t>
-      </w:r>
-    </w:p>
-    <w:p>
-      <w:pPr>
-        <w:spacing w:after="120" w:before="0" w:line="276"/>
+        <w:spacing w:after="200" w:before="320" w:line="360"/>
+      </w:pPr>
+      <w:r>
+        <w:t xml:space="preserve">7 QUALIDADE E VERIFICAÇÃO CONTÍNUA</w:t>
+      </w:r>
+    </w:p>
+    <w:p>
+      <w:pPr>
+        <w:spacing w:after="120" w:before="0" w:line="360"/>
+        <w:ind w:firstLine="709"/>
+        <w:jc w:val="both"/>
       </w:pPr>
       <w:r>
         <w:t xml:space="preserve">Para responder à preocupação levantada pelo orientador — "como saber se o site está ficando lento ou se os painéis estão com dados errados?" — a plataforma adota rotinas automáticas de verificação em três frentes.</w:t>
@@ -2840,7 +2915,7 @@
     <w:p>
       <w:pPr>
         <w:pStyle w:val="Heading2"/>
-        <w:spacing w:after="120" w:before="240"/>
+        <w:spacing w:after="120" w:before="240" w:line="360"/>
       </w:pPr>
       <w:r>
         <w:t xml:space="preserve">Saúde do sistema (o site está lento?)</w:t>
@@ -2853,7 +2928,7 @@
           <w:ilvl w:val="0"/>
           <w:numId w:val="2"/>
         </w:numPr>
-        <w:spacing w:after="80" w:line="276"/>
+        <w:spacing w:after="80" w:line="360"/>
       </w:pPr>
       <w:r>
         <w:rPr>
@@ -2873,7 +2948,7 @@
           <w:ilvl w:val="0"/>
           <w:numId w:val="2"/>
         </w:numPr>
-        <w:spacing w:after="80" w:line="276"/>
+        <w:spacing w:after="80" w:line="360"/>
       </w:pPr>
       <w:r>
         <w:rPr>
@@ -2889,7 +2964,7 @@
     <w:p>
       <w:pPr>
         <w:pStyle w:val="Heading2"/>
-        <w:spacing w:after="120" w:before="240"/>
+        <w:spacing w:after="120" w:before="240" w:line="360"/>
       </w:pPr>
       <w:r>
         <w:t xml:space="preserve">Qualidade dos dados (os painéis estão certos?)</w:t>
@@ -2897,7 +2972,9 @@
     </w:p>
     <w:p>
       <w:pPr>
-        <w:spacing w:after="120" w:before="0" w:line="276"/>
+        <w:spacing w:after="120" w:before="0" w:line="360"/>
+        <w:ind w:firstLine="709"/>
+        <w:jc w:val="both"/>
       </w:pPr>
       <w:r>
         <w:t xml:space="preserve">Painéis errados quase sempre nascem de dados ruins na carga. Por isso, o ETL ganha etapas de validação de qualidade de dados (data quality) antes de publicar no Data Warehouse:</w:t>
@@ -2910,7 +2987,7 @@
           <w:ilvl w:val="0"/>
           <w:numId w:val="2"/>
         </w:numPr>
-        <w:spacing w:after="80" w:line="276"/>
+        <w:spacing w:after="80" w:line="360"/>
       </w:pPr>
       <w:r>
         <w:t xml:space="preserve">Verificação de completude: nenhuma chave estrangeira órfã, nenhum campo obrigatório nulo.</w:t>
@@ -2923,7 +3000,7 @@
           <w:ilvl w:val="0"/>
           <w:numId w:val="2"/>
         </w:numPr>
-        <w:spacing w:after="80" w:line="276"/>
+        <w:spacing w:after="80" w:line="360"/>
       </w:pPr>
       <w:r>
         <w:t xml:space="preserve">Verificação de consistência: somatórios conferem (ex.: valor_comissao + valor_prestador = valor_total).</w:t>
@@ -2936,7 +3013,7 @@
           <w:ilvl w:val="0"/>
           <w:numId w:val="2"/>
         </w:numPr>
-        <w:spacing w:after="80" w:line="276"/>
+        <w:spacing w:after="80" w:line="360"/>
       </w:pPr>
       <w:r>
         <w:t xml:space="preserve">Verificação de volume: a carga do dia está dentro da faixa esperada (uma queda brusca indica falha na extração).</w:t>
@@ -2949,7 +3026,7 @@
           <w:ilvl w:val="0"/>
           <w:numId w:val="2"/>
         </w:numPr>
-        <w:spacing w:after="80" w:line="276"/>
+        <w:spacing w:after="80" w:line="360"/>
       </w:pPr>
       <w:r>
         <w:t xml:space="preserve">Em caso de falha, a carga é interrompida e um alerta é emitido — o painel nunca exibe dado inválido.</w:t>
@@ -2958,7 +3035,7 @@
     <w:p>
       <w:pPr>
         <w:pStyle w:val="Heading2"/>
-        <w:spacing w:after="120" w:before="240"/>
+        <w:spacing w:after="120" w:before="240" w:line="360"/>
       </w:pPr>
       <w:r>
         <w:t xml:space="preserve">Testes automatizados</w:t>
@@ -2966,7 +3043,9 @@
     </w:p>
     <w:p>
       <w:pPr>
-        <w:spacing w:after="120" w:before="0" w:line="276"/>
+        <w:spacing w:after="120" w:before="0" w:line="360"/>
+        <w:ind w:firstLine="709"/>
+        <w:jc w:val="both"/>
       </w:pPr>
       <w:r>
         <w:t xml:space="preserve">Testes unitários, de integração e de ponta a ponta rodam a cada alteração de código (ver seção 8), garantindo que novas funcionalidades não quebrem as existentes.</w:t>
@@ -2980,15 +3059,17 @@
     <w:p>
       <w:pPr>
         <w:pStyle w:val="Heading1"/>
-        <w:spacing w:after="160" w:before="320"/>
-      </w:pPr>
-      <w:r>
-        <w:t xml:space="preserve">8. Spec-Driven Development e CI/CD</w:t>
-      </w:r>
-    </w:p>
-    <w:p>
-      <w:pPr>
-        <w:spacing w:after="120" w:before="0" w:line="276"/>
+        <w:spacing w:after="200" w:before="320" w:line="360"/>
+      </w:pPr>
+      <w:r>
+        <w:t xml:space="preserve">8 SPEC-DRIVEN DEVELOPMENT E CI/CD</w:t>
+      </w:r>
+    </w:p>
+    <w:p>
+      <w:pPr>
+        <w:spacing w:after="120" w:before="0" w:line="360"/>
+        <w:ind w:firstLine="709"/>
+        <w:jc w:val="both"/>
       </w:pPr>
       <w:r>
         <w:t xml:space="preserve">O desenvolvimento da Remio seguiu a abordagem Spec-Driven Development (desenvolvimento guiado por especificação): antes de escrever código, define-se uma especificação clara do que será construído. Este próprio projeto foi conduzido assim — cada parte partiu de um documento de design (DESIGN.md) validado antes da implementação.</w:t>
@@ -2996,13 +3077,27 @@
     </w:p>
     <w:p>
       <w:pPr>
-        <w:spacing w:after="60" w:before="80"/>
+        <w:spacing w:after="40" w:before="160"/>
+        <w:jc w:val="center"/>
+      </w:pPr>
+      <w:r>
+        <w:rPr>
+          <w:color w:val="1F2937"/>
+          <w:sz w:val="20"/>
+          <w:szCs w:val="20"/>
+        </w:rPr>
+        <w:t xml:space="preserve">Figura 4 — Ciclo do spec-driven development integrado ao CI/CD.</w:t>
+      </w:r>
+    </w:p>
+    <w:p>
+      <w:pPr>
+        <w:spacing w:after="40"/>
         <w:jc w:val="center"/>
       </w:pPr>
       <w:r>
         <w:drawing>
           <wp:inline distT="0" distB="0" distL="0" distR="0">
-            <wp:extent cx="5943600" cy="1143000"/>
+            <wp:extent cx="5619750" cy="1076325"/>
             <wp:effectExtent t="0" r="0" b="0" l="0"/>
             <wp:docPr id="1" name="8-cicd-spec.png" descr="Figura 4 — Ciclo do spec-driven development integrado ao CI/CD." title="Figura 4 — Ciclo do spec-driven development integrado ao CI/CD."/>
             <wp:cNvGraphicFramePr>
@@ -3027,7 +3122,7 @@
                   <pic:spPr bwMode="auto">
                     <a:xfrm>
                       <a:off x="0" y="0"/>
-                      <a:ext cx="5943600" cy="1143000"/>
+                      <a:ext cx="5619750" cy="1076325"/>
                     </a:xfrm>
                     <a:prstGeom prst="rect">
                       <a:avLst/>
@@ -3047,18 +3142,18 @@
       </w:pPr>
       <w:r>
         <w:rPr>
-          <w:i/>
-          <w:iCs/>
-          <w:color w:val="6B7280"/>
-          <w:sz w:val="17"/>
-          <w:szCs w:val="17"/>
-        </w:rPr>
-        <w:t xml:space="preserve">Figura 4 — Ciclo do spec-driven development integrado ao CI/CD.</w:t>
-      </w:r>
-    </w:p>
-    <w:p>
-      <w:pPr>
-        <w:spacing w:after="120" w:before="60" w:line="276"/>
+          <w:color w:val="1F2937"/>
+          <w:sz w:val="20"/>
+          <w:szCs w:val="20"/>
+        </w:rPr>
+        <w:t xml:space="preserve">Fonte: elaborado pelos autores (2026).</w:t>
+      </w:r>
+    </w:p>
+    <w:p>
+      <w:pPr>
+        <w:spacing w:after="120" w:before="60" w:line="360"/>
+        <w:ind w:firstLine="709"/>
+        <w:jc w:val="both"/>
       </w:pPr>
       <w:r>
         <w:t xml:space="preserve">O ciclo completo funciona como um fluxo contínuo:</w:t>
@@ -3071,7 +3166,7 @@
           <w:ilvl w:val="0"/>
           <w:numId w:val="2"/>
         </w:numPr>
-        <w:spacing w:after="80" w:line="276"/>
+        <w:spacing w:after="80" w:line="360"/>
       </w:pPr>
       <w:r>
         <w:rPr>
@@ -3091,7 +3186,7 @@
           <w:ilvl w:val="0"/>
           <w:numId w:val="2"/>
         </w:numPr>
-        <w:spacing w:after="80" w:line="276"/>
+        <w:spacing w:after="80" w:line="360"/>
       </w:pPr>
       <w:r>
         <w:rPr>
@@ -3111,7 +3206,7 @@
           <w:ilvl w:val="0"/>
           <w:numId w:val="2"/>
         </w:numPr>
-        <w:spacing w:after="80" w:line="276"/>
+        <w:spacing w:after="80" w:line="360"/>
       </w:pPr>
       <w:r>
         <w:rPr>
@@ -3126,7 +3221,9 @@
     </w:p>
     <w:p>
       <w:pPr>
-        <w:spacing w:after="120" w:before="80" w:line="276"/>
+        <w:spacing w:after="120" w:before="80" w:line="360"/>
+        <w:ind w:firstLine="709"/>
+        <w:jc w:val="both"/>
       </w:pPr>
       <w:r>
         <w:rPr>
@@ -3147,15 +3244,17 @@
     <w:p>
       <w:pPr>
         <w:pStyle w:val="Heading1"/>
-        <w:spacing w:after="160" w:before="320"/>
-      </w:pPr>
-      <w:r>
-        <w:t xml:space="preserve">9. Repositório de Erros e Correção</w:t>
-      </w:r>
-    </w:p>
-    <w:p>
-      <w:pPr>
-        <w:spacing w:after="120" w:before="0" w:line="276"/>
+        <w:spacing w:after="200" w:before="320" w:line="360"/>
+      </w:pPr>
+      <w:r>
+        <w:t xml:space="preserve">9 REPOSITÓRIO DE ERROS E CORREÇÃO</w:t>
+      </w:r>
+    </w:p>
+    <w:p>
+      <w:pPr>
+        <w:spacing w:after="120" w:before="0" w:line="360"/>
+        <w:ind w:firstLine="709"/>
+        <w:jc w:val="both"/>
       </w:pPr>
       <w:r>
         <w:t xml:space="preserve">Um repositório de erros centraliza, registra e prioriza as falhas que ocorrem em produção, transformando-as em correções. Em vez de depender de o usuário relatar um problema, o próprio sistema captura e cataloga cada erro.</w:t>
@@ -3163,7 +3262,7 @@
     </w:p>
     <w:tbl>
       <w:tblPr>
-        <w:tblW w:type="dxa" w:w="9360"/>
+        <w:tblW w:type="dxa" w:w="9071"/>
         <w:tblBorders>
           <w:top w:val="single" w:color="auto" w:sz="4"/>
           <w:left w:val="single" w:color="auto" w:sz="4"/>
@@ -3174,8 +3273,8 @@
         </w:tblBorders>
       </w:tblPr>
       <w:tblGrid>
-        <w:gridCol w:w="2200"/>
-        <w:gridCol w:w="7160"/>
+        <w:gridCol w:w="2132"/>
+        <w:gridCol w:w="6939"/>
       </w:tblGrid>
       <w:tr>
         <w:trPr>
@@ -3183,7 +3282,7 @@
         </w:trPr>
         <w:tc>
           <w:tcPr>
-            <w:tcW w:type="dxa" w:w="2200"/>
+            <w:tcW w:type="dxa" w:w="2132"/>
             <w:tcBorders>
               <w:top w:val="single" w:color="CCCCCC" w:sz="1"/>
               <w:left w:val="single" w:color="CCCCCC" w:sz="1"/>
@@ -3214,7 +3313,7 @@
         </w:tc>
         <w:tc>
           <w:tcPr>
-            <w:tcW w:type="dxa" w:w="7160"/>
+            <w:tcW w:type="dxa" w:w="6939"/>
             <w:tcBorders>
               <w:top w:val="single" w:color="CCCCCC" w:sz="1"/>
               <w:left w:val="single" w:color="CCCCCC" w:sz="1"/>
@@ -3247,7 +3346,7 @@
       <w:tr>
         <w:tc>
           <w:tcPr>
-            <w:tcW w:type="dxa" w:w="2200"/>
+            <w:tcW w:type="dxa" w:w="2132"/>
             <w:tcBorders>
               <w:top w:val="single" w:color="CCCCCC" w:sz="1"/>
               <w:left w:val="single" w:color="CCCCCC" w:sz="1"/>
@@ -3275,7 +3374,7 @@
         </w:tc>
         <w:tc>
           <w:tcPr>
-            <w:tcW w:type="dxa" w:w="7160"/>
+            <w:tcW w:type="dxa" w:w="6939"/>
             <w:tcBorders>
               <w:top w:val="single" w:color="CCCCCC" w:sz="1"/>
               <w:left w:val="single" w:color="CCCCCC" w:sz="1"/>
@@ -3305,7 +3404,7 @@
       <w:tr>
         <w:tc>
           <w:tcPr>
-            <w:tcW w:type="dxa" w:w="2200"/>
+            <w:tcW w:type="dxa" w:w="2132"/>
             <w:tcBorders>
               <w:top w:val="single" w:color="CCCCCC" w:sz="1"/>
               <w:left w:val="single" w:color="CCCCCC" w:sz="1"/>
@@ -3334,7 +3433,7 @@
         </w:tc>
         <w:tc>
           <w:tcPr>
-            <w:tcW w:type="dxa" w:w="7160"/>
+            <w:tcW w:type="dxa" w:w="6939"/>
             <w:tcBorders>
               <w:top w:val="single" w:color="CCCCCC" w:sz="1"/>
               <w:left w:val="single" w:color="CCCCCC" w:sz="1"/>
@@ -3365,7 +3464,7 @@
       <w:tr>
         <w:tc>
           <w:tcPr>
-            <w:tcW w:type="dxa" w:w="2200"/>
+            <w:tcW w:type="dxa" w:w="2132"/>
             <w:tcBorders>
               <w:top w:val="single" w:color="CCCCCC" w:sz="1"/>
               <w:left w:val="single" w:color="CCCCCC" w:sz="1"/>
@@ -3393,7 +3492,7 @@
         </w:tc>
         <w:tc>
           <w:tcPr>
-            <w:tcW w:type="dxa" w:w="7160"/>
+            <w:tcW w:type="dxa" w:w="6939"/>
             <w:tcBorders>
               <w:top w:val="single" w:color="CCCCCC" w:sz="1"/>
               <w:left w:val="single" w:color="CCCCCC" w:sz="1"/>
@@ -3423,7 +3522,7 @@
       <w:tr>
         <w:tc>
           <w:tcPr>
-            <w:tcW w:type="dxa" w:w="2200"/>
+            <w:tcW w:type="dxa" w:w="2132"/>
             <w:tcBorders>
               <w:top w:val="single" w:color="CCCCCC" w:sz="1"/>
               <w:left w:val="single" w:color="CCCCCC" w:sz="1"/>
@@ -3452,7 +3551,7 @@
         </w:tc>
         <w:tc>
           <w:tcPr>
-            <w:tcW w:type="dxa" w:w="7160"/>
+            <w:tcW w:type="dxa" w:w="6939"/>
             <w:tcBorders>
               <w:top w:val="single" w:color="CCCCCC" w:sz="1"/>
               <w:left w:val="single" w:color="CCCCCC" w:sz="1"/>
@@ -3483,7 +3582,9 @@
     </w:tbl>
     <w:p>
       <w:pPr>
-        <w:spacing w:after="120" w:before="80" w:line="276"/>
+        <w:spacing w:after="120" w:before="80" w:line="360"/>
+        <w:ind w:firstLine="709"/>
+        <w:jc w:val="both"/>
       </w:pPr>
       <w:r>
         <w:t xml:space="preserve">No protótipo, esse conceito será demonstrado de forma simplificada: uma tela que captura erros de JavaScript do navegador e os exibe em uma lista — uma versão didática do repositório de erros.</w:t>
@@ -3497,15 +3598,17 @@
     <w:p>
       <w:pPr>
         <w:pStyle w:val="Heading1"/>
-        <w:spacing w:after="160" w:before="320"/>
-      </w:pPr>
-      <w:r>
-        <w:t xml:space="preserve">10. Fluxos de Inteligência Artificial</w:t>
-      </w:r>
-    </w:p>
-    <w:p>
-      <w:pPr>
-        <w:spacing w:after="120" w:before="0" w:line="276"/>
+        <w:spacing w:after="200" w:before="320" w:line="360"/>
+      </w:pPr>
+      <w:r>
+        <w:t xml:space="preserve">10 FLUXOS DE INTELIGÊNCIA ARTIFICIAL</w:t>
+      </w:r>
+    </w:p>
+    <w:p>
+      <w:pPr>
+        <w:spacing w:after="120" w:before="0" w:line="360"/>
+        <w:ind w:firstLine="709"/>
+        <w:jc w:val="both"/>
       </w:pPr>
       <w:r>
         <w:t xml:space="preserve">A Inteligência Artificial amplia o valor da plataforma em várias frentes. Os principais casos de uso previstos para a Remio:</w:t>
@@ -3513,7 +3616,7 @@
     </w:p>
     <w:tbl>
       <w:tblPr>
-        <w:tblW w:type="dxa" w:w="9360"/>
+        <w:tblW w:type="dxa" w:w="9071"/>
         <w:tblBorders>
           <w:top w:val="single" w:color="auto" w:sz="4"/>
           <w:left w:val="single" w:color="auto" w:sz="4"/>
@@ -3524,8 +3627,8 @@
         </w:tblBorders>
       </w:tblPr>
       <w:tblGrid>
-        <w:gridCol w:w="2700"/>
-        <w:gridCol w:w="6660"/>
+        <w:gridCol w:w="2617"/>
+        <w:gridCol w:w="6454"/>
       </w:tblGrid>
       <w:tr>
         <w:trPr>
@@ -3533,7 +3636,7 @@
         </w:trPr>
         <w:tc>
           <w:tcPr>
-            <w:tcW w:type="dxa" w:w="2700"/>
+            <w:tcW w:type="dxa" w:w="2617"/>
             <w:tcBorders>
               <w:top w:val="single" w:color="CCCCCC" w:sz="1"/>
               <w:left w:val="single" w:color="CCCCCC" w:sz="1"/>
@@ -3564,7 +3667,7 @@
         </w:tc>
         <w:tc>
           <w:tcPr>
-            <w:tcW w:type="dxa" w:w="6660"/>
+            <w:tcW w:type="dxa" w:w="6454"/>
             <w:tcBorders>
               <w:top w:val="single" w:color="CCCCCC" w:sz="1"/>
               <w:left w:val="single" w:color="CCCCCC" w:sz="1"/>
@@ -3597,7 +3700,7 @@
       <w:tr>
         <w:tc>
           <w:tcPr>
-            <w:tcW w:type="dxa" w:w="2700"/>
+            <w:tcW w:type="dxa" w:w="2617"/>
             <w:tcBorders>
               <w:top w:val="single" w:color="CCCCCC" w:sz="1"/>
               <w:left w:val="single" w:color="CCCCCC" w:sz="1"/>
@@ -3625,7 +3728,7 @@
         </w:tc>
         <w:tc>
           <w:tcPr>
-            <w:tcW w:type="dxa" w:w="6660"/>
+            <w:tcW w:type="dxa" w:w="6454"/>
             <w:tcBorders>
               <w:top w:val="single" w:color="CCCCCC" w:sz="1"/>
               <w:left w:val="single" w:color="CCCCCC" w:sz="1"/>
@@ -3655,7 +3758,7 @@
       <w:tr>
         <w:tc>
           <w:tcPr>
-            <w:tcW w:type="dxa" w:w="2700"/>
+            <w:tcW w:type="dxa" w:w="2617"/>
             <w:tcBorders>
               <w:top w:val="single" w:color="CCCCCC" w:sz="1"/>
               <w:left w:val="single" w:color="CCCCCC" w:sz="1"/>
@@ -3684,7 +3787,7 @@
         </w:tc>
         <w:tc>
           <w:tcPr>
-            <w:tcW w:type="dxa" w:w="6660"/>
+            <w:tcW w:type="dxa" w:w="6454"/>
             <w:tcBorders>
               <w:top w:val="single" w:color="CCCCCC" w:sz="1"/>
               <w:left w:val="single" w:color="CCCCCC" w:sz="1"/>
@@ -3715,7 +3818,7 @@
       <w:tr>
         <w:tc>
           <w:tcPr>
-            <w:tcW w:type="dxa" w:w="2700"/>
+            <w:tcW w:type="dxa" w:w="2617"/>
             <w:tcBorders>
               <w:top w:val="single" w:color="CCCCCC" w:sz="1"/>
               <w:left w:val="single" w:color="CCCCCC" w:sz="1"/>
@@ -3743,7 +3846,7 @@
         </w:tc>
         <w:tc>
           <w:tcPr>
-            <w:tcW w:type="dxa" w:w="6660"/>
+            <w:tcW w:type="dxa" w:w="6454"/>
             <w:tcBorders>
               <w:top w:val="single" w:color="CCCCCC" w:sz="1"/>
               <w:left w:val="single" w:color="CCCCCC" w:sz="1"/>
@@ -3773,7 +3876,7 @@
       <w:tr>
         <w:tc>
           <w:tcPr>
-            <w:tcW w:type="dxa" w:w="2700"/>
+            <w:tcW w:type="dxa" w:w="2617"/>
             <w:tcBorders>
               <w:top w:val="single" w:color="CCCCCC" w:sz="1"/>
               <w:left w:val="single" w:color="CCCCCC" w:sz="1"/>
@@ -3802,7 +3905,7 @@
         </w:tc>
         <w:tc>
           <w:tcPr>
-            <w:tcW w:type="dxa" w:w="6660"/>
+            <w:tcW w:type="dxa" w:w="6454"/>
             <w:tcBorders>
               <w:top w:val="single" w:color="CCCCCC" w:sz="1"/>
               <w:left w:val="single" w:color="CCCCCC" w:sz="1"/>
@@ -3833,7 +3936,7 @@
       <w:tr>
         <w:tc>
           <w:tcPr>
-            <w:tcW w:type="dxa" w:w="2700"/>
+            <w:tcW w:type="dxa" w:w="2617"/>
             <w:tcBorders>
               <w:top w:val="single" w:color="CCCCCC" w:sz="1"/>
               <w:left w:val="single" w:color="CCCCCC" w:sz="1"/>
@@ -3861,7 +3964,7 @@
         </w:tc>
         <w:tc>
           <w:tcPr>
-            <w:tcW w:type="dxa" w:w="6660"/>
+            <w:tcW w:type="dxa" w:w="6454"/>
             <w:tcBorders>
               <w:top w:val="single" w:color="CCCCCC" w:sz="1"/>
               <w:left w:val="single" w:color="CCCCCC" w:sz="1"/>
@@ -3891,7 +3994,9 @@
     </w:tbl>
     <w:p>
       <w:pPr>
-        <w:spacing w:after="120" w:before="0" w:line="276"/>
+        <w:spacing w:after="120" w:before="0" w:line="360"/>
+        <w:ind w:firstLine="709"/>
+        <w:jc w:val="both"/>
       </w:pPr>
       <w:r>
         <w:t xml:space="preserve">O primeiro caso — análise das avaliações — foi efetivamente implementado neste trabalho, usando a API da Claude (Anthropic). O fluxo recebe os comentários dos clientes e devolve uma análise estruturada (sentimento, temas e sugestões de melhoria), conectando-se à observabilidade como uma fonte automática de insights.</w:t>
@@ -3899,13 +4004,27 @@
     </w:p>
     <w:p>
       <w:pPr>
-        <w:spacing w:after="60" w:before="80"/>
+        <w:spacing w:after="40" w:before="160"/>
+        <w:jc w:val="center"/>
+      </w:pPr>
+      <w:r>
+        <w:rPr>
+          <w:color w:val="1F2937"/>
+          <w:sz w:val="20"/>
+          <w:szCs w:val="20"/>
+        </w:rPr>
+        <w:t xml:space="preserve">Figura 5 — Fluxo de IA: das avaliações à análise estruturada pela API da Claude.</w:t>
+      </w:r>
+    </w:p>
+    <w:p>
+      <w:pPr>
+        <w:spacing w:after="40"/>
         <w:jc w:val="center"/>
       </w:pPr>
       <w:r>
         <w:drawing>
           <wp:inline distT="0" distB="0" distL="0" distR="0">
-            <wp:extent cx="5943600" cy="1028700"/>
+            <wp:extent cx="5619750" cy="981075"/>
             <wp:effectExtent t="0" r="0" b="0" l="0"/>
             <wp:docPr id="1" name="9-fluxo-ia.png" descr="Figura 5 — Fluxo de IA: das avaliações à análise estruturada pela API da Claude." title="Figura 5 — Fluxo de IA: das avaliações à análise estruturada pela API da Claude."/>
             <wp:cNvGraphicFramePr>
@@ -3930,7 +4049,7 @@
                   <pic:spPr bwMode="auto">
                     <a:xfrm>
                       <a:off x="0" y="0"/>
-                      <a:ext cx="5943600" cy="1028700"/>
+                      <a:ext cx="5619750" cy="981075"/>
                     </a:xfrm>
                     <a:prstGeom prst="rect">
                       <a:avLst/>
@@ -3950,18 +4069,18 @@
       </w:pPr>
       <w:r>
         <w:rPr>
-          <w:i/>
-          <w:iCs/>
-          <w:color w:val="6B7280"/>
-          <w:sz w:val="17"/>
-          <w:szCs w:val="17"/>
-        </w:rPr>
-        <w:t xml:space="preserve">Figura 5 — Fluxo de IA: das avaliações à análise estruturada pela API da Claude.</w:t>
-      </w:r>
-    </w:p>
-    <w:p>
-      <w:pPr>
-        <w:spacing w:after="120" w:before="80" w:line="276"/>
+          <w:color w:val="1F2937"/>
+          <w:sz w:val="20"/>
+          <w:szCs w:val="20"/>
+        </w:rPr>
+        <w:t xml:space="preserve">Fonte: elaborado pelos autores (2026).</w:t>
+      </w:r>
+    </w:p>
+    <w:p>
+      <w:pPr>
+        <w:spacing w:after="120" w:before="80" w:line="360"/>
+        <w:ind w:firstLine="709"/>
+        <w:jc w:val="both"/>
       </w:pPr>
       <w:r>
         <w:rPr>
@@ -3982,15 +4101,17 @@
     <w:p>
       <w:pPr>
         <w:pStyle w:val="Heading1"/>
-        <w:spacing w:after="160" w:before="320"/>
-      </w:pPr>
-      <w:r>
-        <w:t xml:space="preserve">11. Considerações Finais</w:t>
-      </w:r>
-    </w:p>
-    <w:p>
-      <w:pPr>
-        <w:spacing w:after="120" w:before="0" w:line="276"/>
+        <w:spacing w:after="200" w:before="320" w:line="360"/>
+      </w:pPr>
+      <w:r>
+        <w:t xml:space="preserve">11 CONSIDERAÇÕES FINAIS</w:t>
+      </w:r>
+    </w:p>
+    <w:p>
+      <w:pPr>
+        <w:spacing w:after="120" w:before="0" w:line="360"/>
+        <w:ind w:firstLine="709"/>
+        <w:jc w:val="both"/>
       </w:pPr>
       <w:r>
         <w:t xml:space="preserve">Este documento elevou a Remio de um protótipo funcional para uma plataforma pensada de ponta a ponta sob critérios profissionais de engenharia: arquitetura em camadas com evolução planejada de monólito a microsserviços, segurança em profundidade, observabilidade nos três pilares, resiliência a falhas, gestão de backups, verificação contínua de saúde e de qualidade de dados, metodologia spec-driven com CI/CD, rastreamento de erros e uso aplicado de Inteligência Artificial.</w:t>
@@ -3998,16 +4119,18 @@
     </w:p>
     <w:p>
       <w:pPr>
-        <w:spacing w:after="120" w:before="0" w:line="276"/>
+        <w:spacing w:after="120" w:before="0" w:line="360"/>
+        <w:ind w:firstLine="709"/>
+        <w:jc w:val="both"/>
       </w:pPr>
       <w:r>
         <w:t xml:space="preserve">Em conjunto, esses elementos demonstram maturidade arquitetural e respondem diretamente às melhorias sugeridas pelo orientador, fortalecendo a fundamentação técnica do trabalho. O protótipo permanece como prova de conceito da experiência do usuário e da camada de BI, enquanto esta arquitetura define o caminho para a operação real e escalável da plataforma.</w:t>
       </w:r>
     </w:p>
     <w:sectPr>
-      <w:footerReference w:type="default" r:id="rId7"/>
-      <w:pgSz w:w="12240" w:h="15840" w:orient="portrait"/>
-      <w:pgMar w:top="1440" w:right="1440" w:bottom="1440" w:left="1440" w:header="708" w:footer="708" w:gutter="0"/>
+      <w:headerReference w:type="default" r:id="rId7"/>
+      <w:pgSz w:w="11906" w:h="16838" w:orient="portrait"/>
+      <w:pgMar w:top="1701" w:right="1134" w:bottom="1134" w:left="1701" w:header="708" w:footer="708" w:gutter="0"/>
       <w:pgNumType/>
       <w:docGrid w:linePitch="360"/>
     </w:sectPr>
@@ -4056,33 +4179,54 @@
 </w:endnotes>
 </file>
 
-<file path=word/footer1.xml><?xml version="1.0" encoding="utf-8"?>
-<w:ftr xmlns:wpc="http://schemas.microsoft.com/office/word/2010/wordprocessingCanvas" xmlns:mc="http://schemas.openxmlformats.org/markup-compatibility/2006" xmlns:o="urn:schemas-microsoft-com:office:office" xmlns:r="http://schemas.openxmlformats.org/officeDocument/2006/relationships" xmlns:m="http://schemas.openxmlformats.org/officeDocument/2006/math" xmlns:v="urn:schemas-microsoft-com:vml" xmlns:wp14="http://schemas.microsoft.com/office/word/2010/wordprocessingDrawing" xmlns:wp="http://schemas.openxmlformats.org/drawingml/2006/wordprocessingDrawing" xmlns:w10="urn:schemas-microsoft-com:office:word" xmlns:w="http://schemas.openxmlformats.org/wordprocessingml/2006/main" xmlns:w14="http://schemas.microsoft.com/office/word/2010/wordml" xmlns:w15="http://schemas.microsoft.com/office/word/2012/wordml" xmlns:wpg="http://schemas.microsoft.com/office/word/2010/wordprocessingGroup" xmlns:wpi="http://schemas.microsoft.com/office/word/2010/wordprocessingInk" xmlns:wne="http://schemas.microsoft.com/office/word/2006/wordml" xmlns:wps="http://schemas.microsoft.com/office/word/2010/wordprocessingShape">
+<file path=word/footnotes.xml><?xml version="1.0" encoding="utf-8"?>
+<w:footnotes xmlns:wpc="http://schemas.microsoft.com/office/word/2010/wordprocessingCanvas" xmlns:mc="http://schemas.openxmlformats.org/markup-compatibility/2006" xmlns:o="urn:schemas-microsoft-com:office:office" xmlns:r="http://schemas.openxmlformats.org/officeDocument/2006/relationships" xmlns:m="http://schemas.openxmlformats.org/officeDocument/2006/math" xmlns:v="urn:schemas-microsoft-com:vml" xmlns:wp14="http://schemas.microsoft.com/office/word/2010/wordprocessingDrawing" xmlns:wp="http://schemas.openxmlformats.org/drawingml/2006/wordprocessingDrawing" xmlns:w10="urn:schemas-microsoft-com:office:word" xmlns:w="http://schemas.openxmlformats.org/wordprocessingml/2006/main" xmlns:w14="http://schemas.microsoft.com/office/word/2010/wordml" xmlns:w15="http://schemas.microsoft.com/office/word/2012/wordml" xmlns:wpg="http://schemas.microsoft.com/office/word/2010/wordprocessingGroup" xmlns:wpi="http://schemas.microsoft.com/office/word/2010/wordprocessingInk" xmlns:wne="http://schemas.microsoft.com/office/word/2006/wordml" xmlns:wps="http://schemas.microsoft.com/office/word/2010/wordprocessingShape" mc:Ignorable="w14 w15 wp14">
+  <w:footnote w:type="separator" w:id="-1">
+    <w:p>
+      <w:pPr>
+        <w:spacing w:after="0" w:line="240" w:lineRule="auto"/>
+      </w:pPr>
+      <w:r>
+        <w:rPr>
+          <w:rStyle w:val="FootnoteReference"/>
+        </w:rPr>
+        <w:footnoteRef/>
+      </w:r>
+      <w:r>
+        <w:separator/>
+      </w:r>
+    </w:p>
+  </w:footnote>
+  <w:footnote w:type="continuationSeparator" w:id="0">
+    <w:p>
+      <w:pPr>
+        <w:spacing w:after="0" w:line="240" w:lineRule="auto"/>
+      </w:pPr>
+      <w:r>
+        <w:rPr>
+          <w:rStyle w:val="FootnoteReference"/>
+        </w:rPr>
+        <w:footnoteRef/>
+      </w:r>
+      <w:r>
+        <w:continuationSeparator/>
+      </w:r>
+    </w:p>
+  </w:footnote>
+</w:footnotes>
+</file>
+
+<file path=word/header1.xml><?xml version="1.0" encoding="utf-8"?>
+<w:hdr xmlns:wpc="http://schemas.microsoft.com/office/word/2010/wordprocessingCanvas" xmlns:mc="http://schemas.openxmlformats.org/markup-compatibility/2006" xmlns:o="urn:schemas-microsoft-com:office:office" xmlns:r="http://schemas.openxmlformats.org/officeDocument/2006/relationships" xmlns:m="http://schemas.openxmlformats.org/officeDocument/2006/math" xmlns:v="urn:schemas-microsoft-com:vml" xmlns:wp14="http://schemas.microsoft.com/office/word/2010/wordprocessingDrawing" xmlns:wp="http://schemas.openxmlformats.org/drawingml/2006/wordprocessingDrawing" xmlns:w10="urn:schemas-microsoft-com:office:word" xmlns:w="http://schemas.openxmlformats.org/wordprocessingml/2006/main" xmlns:w14="http://schemas.microsoft.com/office/word/2010/wordml" xmlns:w15="http://schemas.microsoft.com/office/word/2012/wordml" xmlns:wpg="http://schemas.microsoft.com/office/word/2010/wordprocessingGroup" xmlns:wpi="http://schemas.microsoft.com/office/word/2010/wordprocessingInk" xmlns:wne="http://schemas.microsoft.com/office/word/2006/wordml" xmlns:wps="http://schemas.microsoft.com/office/word/2010/wordprocessingShape" xmlns:cx="http://schemas.microsoft.com/office/drawing/2014/chartex" xmlns:cx1="http://schemas.microsoft.com/office/drawing/2015/9/8/chartex" xmlns:cx2="http://schemas.microsoft.com/office/drawing/2015/10/21/chartex" xmlns:cx3="http://schemas.microsoft.com/office/drawing/2016/5/9/chartex" xmlns:cx4="http://schemas.microsoft.com/office/drawing/2016/5/10/chartex" xmlns:cx5="http://schemas.microsoft.com/office/drawing/2016/5/11/chartex" xmlns:cx6="http://schemas.microsoft.com/office/drawing/2016/5/12/chartex" xmlns:cx7="http://schemas.microsoft.com/office/drawing/2016/5/13/chartex" xmlns:cx8="http://schemas.microsoft.com/office/drawing/2016/5/14/chartex" xmlns:w16cid="http://schemas.microsoft.com/office/word/2016/wordml/cid" xmlns:w16se="http://schemas.microsoft.com/office/word/2015/wordml/symex">
   <w:p>
     <w:pPr>
-      <w:jc w:val="center"/>
+      <w:jc w:val="right"/>
     </w:pPr>
     <w:r>
       <w:rPr>
-        <w:color w:val="9CA3AF"/>
-        <w:sz w:val="16"/>
-        <w:szCs w:val="16"/>
-      </w:rPr>
-      <w:t xml:space="preserve">Remio — Arquitetura, Segurança e Qualidade  |  </w:t>
-    </w:r>
-    <w:r>
-      <w:rPr>
-        <w:color w:val="9CA3AF"/>
-        <w:sz w:val="16"/>
-        <w:szCs w:val="16"/>
-      </w:rPr>
-      <w:t xml:space="preserve">Página </w:t>
-    </w:r>
-    <w:r>
-      <w:rPr>
-        <w:color w:val="9CA3AF"/>
-        <w:sz w:val="16"/>
-        <w:szCs w:val="16"/>
+        <w:color w:val="1F2937"/>
+        <w:sz w:val="20"/>
+        <w:szCs w:val="20"/>
       </w:rPr>
       <w:fldChar w:fldCharType="begin"/>
       <w:instrText xml:space="preserve">PAGE</w:instrText>
@@ -4090,44 +4234,7 @@
       <w:fldChar w:fldCharType="end"/>
     </w:r>
   </w:p>
-</w:ftr>
-</file>
-
-<file path=word/footnotes.xml><?xml version="1.0" encoding="utf-8"?>
-<w:footnotes xmlns:wpc="http://schemas.microsoft.com/office/word/2010/wordprocessingCanvas" xmlns:mc="http://schemas.openxmlformats.org/markup-compatibility/2006" xmlns:o="urn:schemas-microsoft-com:office:office" xmlns:r="http://schemas.openxmlformats.org/officeDocument/2006/relationships" xmlns:m="http://schemas.openxmlformats.org/officeDocument/2006/math" xmlns:v="urn:schemas-microsoft-com:vml" xmlns:wp14="http://schemas.microsoft.com/office/word/2010/wordprocessingDrawing" xmlns:wp="http://schemas.openxmlformats.org/drawingml/2006/wordprocessingDrawing" xmlns:w10="urn:schemas-microsoft-com:office:word" xmlns:w="http://schemas.openxmlformats.org/wordprocessingml/2006/main" xmlns:w14="http://schemas.microsoft.com/office/word/2010/wordml" xmlns:w15="http://schemas.microsoft.com/office/word/2012/wordml" xmlns:wpg="http://schemas.microsoft.com/office/word/2010/wordprocessingGroup" xmlns:wpi="http://schemas.microsoft.com/office/word/2010/wordprocessingInk" xmlns:wne="http://schemas.microsoft.com/office/word/2006/wordml" xmlns:wps="http://schemas.microsoft.com/office/word/2010/wordprocessingShape" mc:Ignorable="w14 w15 wp14">
-  <w:footnote w:type="separator" w:id="-1">
-    <w:p>
-      <w:pPr>
-        <w:spacing w:after="0" w:line="240" w:lineRule="auto"/>
-      </w:pPr>
-      <w:r>
-        <w:rPr>
-          <w:rStyle w:val="FootnoteReference"/>
-        </w:rPr>
-        <w:footnoteRef/>
-      </w:r>
-      <w:r>
-        <w:separator/>
-      </w:r>
-    </w:p>
-  </w:footnote>
-  <w:footnote w:type="continuationSeparator" w:id="0">
-    <w:p>
-      <w:pPr>
-        <w:spacing w:after="0" w:line="240" w:lineRule="auto"/>
-      </w:pPr>
-      <w:r>
-        <w:rPr>
-          <w:rStyle w:val="FootnoteReference"/>
-        </w:rPr>
-        <w:footnoteRef/>
-      </w:r>
-      <w:r>
-        <w:continuationSeparator/>
-      </w:r>
-    </w:p>
-  </w:footnote>
-</w:footnotes>
+</w:hdr>
 </file>
 
 <file path=word/numbering.xml><?xml version="1.0" encoding="utf-8"?>
@@ -4250,8 +4357,8 @@
       <w:rPr>
         <w:rFonts w:ascii="Arial" w:cs="Arial" w:eastAsia="Arial" w:hAnsi="Arial"/>
         <w:color w:val="1F2937"/>
-        <w:sz w:val="22"/>
-        <w:szCs w:val="22"/>
+        <w:sz w:val="24"/>
+        <w:szCs w:val="24"/>
       </w:rPr>
     </w:rPrDefault>
     <w:pPrDefault/>
@@ -4433,10 +4540,7 @@
     <w:next w:val="Normal"/>
     <w:qFormat/>
     <w:pPr>
-      <w:pBdr>
-        <w:bottom w:val="single" w:color="EA580C" w:sz="6" w:space="4"/>
-      </w:pBdr>
-      <w:spacing w:after="160" w:before="320"/>
+      <w:spacing w:after="200" w:before="320" w:line="360"/>
       <w:outlineLvl w:val="0"/>
     </w:pPr>
     <w:rPr>
@@ -4444,8 +4548,8 @@
       <w:b/>
       <w:bCs/>
       <w:color w:val="EA580C"/>
-      <w:sz w:val="30"/>
-      <w:szCs w:val="30"/>
+      <w:sz w:val="28"/>
+      <w:szCs w:val="28"/>
     </w:rPr>
   </w:style>
   <w:style w:type="paragraph" w:styleId="Heading2">
@@ -4454,16 +4558,16 @@
     <w:next w:val="Normal"/>
     <w:qFormat/>
     <w:pPr>
-      <w:spacing w:after="100" w:before="220"/>
+      <w:spacing w:after="120" w:before="240" w:line="360"/>
       <w:outlineLvl w:val="1"/>
     </w:pPr>
     <w:rPr>
       <w:rFonts w:ascii="Arial" w:cs="Arial" w:eastAsia="Arial" w:hAnsi="Arial"/>
       <w:b/>
       <w:bCs/>
-      <w:color w:val="1F2937"/>
-      <w:sz w:val="25"/>
-      <w:szCs w:val="25"/>
+      <w:color w:val="EA580C"/>
+      <w:sz w:val="24"/>
+      <w:szCs w:val="24"/>
     </w:rPr>
   </w:style>
 </w:styles>

</xml_diff>